<commit_message>
phân tích biểu đồ MCA
</commit_message>
<xml_diff>
--- a/LeDuyTuanAnh_NguyenTuanAnh_LyLamVu.docx
+++ b/LeDuyTuanAnh_NguyenTuanAnh_LyLamVu.docx
@@ -609,7 +609,16 @@
                 <w:sz w:val="26"/>
                 <w:szCs w:val="26"/>
               </w:rPr>
-              <w:t>23050084</w:t>
+              <w:t>23</w:t>
+            </w:r>
+            <w:r>
+              <w:rPr>
+                <w:b/>
+                <w:bCs/>
+                <w:sz w:val="26"/>
+                <w:szCs w:val="26"/>
+              </w:rPr>
+              <w:t>050102</w:t>
             </w:r>
           </w:p>
           <w:p>
@@ -1472,6 +1481,7 @@
                 <w:szCs w:val="22"/>
               </w:rPr>
             </w:pPr>
+            <w:proofErr w:type="gramStart"/>
             <w:r>
               <w:rPr>
                 <w:rFonts w:cstheme="minorHAnsi"/>
@@ -1481,8 +1491,33 @@
                 <w:sz w:val="24"/>
                 <w:szCs w:val="22"/>
               </w:rPr>
-              <w:t>( Ký và ghi rõ họ tên )</w:t>
-            </w:r>
+              <w:t>( Ký</w:t>
+            </w:r>
+            <w:proofErr w:type="gramEnd"/>
+            <w:r>
+              <w:rPr>
+                <w:rFonts w:cstheme="minorHAnsi"/>
+                <w:i/>
+                <w:iCs/>
+                <w:color w:val="000000" w:themeColor="text1"/>
+                <w:sz w:val="24"/>
+                <w:szCs w:val="22"/>
+              </w:rPr>
+              <w:t xml:space="preserve"> và ghi rõ họ </w:t>
+            </w:r>
+            <w:proofErr w:type="gramStart"/>
+            <w:r>
+              <w:rPr>
+                <w:rFonts w:cstheme="minorHAnsi"/>
+                <w:i/>
+                <w:iCs/>
+                <w:color w:val="000000" w:themeColor="text1"/>
+                <w:sz w:val="24"/>
+                <w:szCs w:val="22"/>
+              </w:rPr>
+              <w:t>tên )</w:t>
+            </w:r>
+            <w:proofErr w:type="gramEnd"/>
           </w:p>
           <w:p/>
         </w:tc>
@@ -3133,21 +3168,7 @@
                 <w:rStyle w:val="Hyperlink"/>
                 <w:noProof/>
               </w:rPr>
-              <w:t>2.2.4 Giảm c</w:t>
-            </w:r>
-            <w:r>
-              <w:rPr>
-                <w:rStyle w:val="Hyperlink"/>
-                <w:noProof/>
-              </w:rPr>
-              <w:t>h</w:t>
-            </w:r>
-            <w:r>
-              <w:rPr>
-                <w:rStyle w:val="Hyperlink"/>
-                <w:noProof/>
-              </w:rPr>
-              <w:t>iều dữ liệu và gom cụm dữ liệu</w:t>
+              <w:t>2.2.4 Giảm chiều dữ liệu và gom cụm dữ liệu</w:t>
             </w:r>
             <w:r>
               <w:rPr>
@@ -6239,13 +6260,21 @@
         <w:tab/>
       </w:r>
       <w:r>
-        <w:t>Trong bối cảnh thương mại điện tử phát triển mạnh mẽ, các nền tảng như Shopee đã trở thành kênh phân phối quan trọng đối với các sản phẩm điện thoại di động. Đây là mặt hàng có nhu cầu cao nhưng cũng đi kèm với mức độ cạnh tranh lớn</w:t>
+        <w:t xml:space="preserve">Trong bối cảnh thương mại điện tử phát triển mạnh mẽ, các nền tảng như Shopee đã trở thành kênh phân phối quan trọng đối với các sản phẩm điện thoại di động. Đây là mặt hàng có nhu cầu cao nhưng cũng đi kèm với mức độ cạnh tranh </w:t>
+      </w:r>
+      <w:proofErr w:type="gramStart"/>
+      <w:r>
+        <w:t>lớn</w:t>
       </w:r>
       <w:r>
         <w:t xml:space="preserve">, </w:t>
       </w:r>
       <w:r>
-        <w:t xml:space="preserve"> thực tế cho thấy không phải tất cả sản phẩm đều đạt hiệu quả kinh doanh. Một số có doanh số thấp do chưa phù hợp với nhu cầu thị trường, mức giá chưa tối ưu hoặc chưa được tiếp cận đúng tệp khách hàng mục tiêu. </w:t>
+        <w:t xml:space="preserve"> thực</w:t>
+      </w:r>
+      <w:proofErr w:type="gramEnd"/>
+      <w:r>
+        <w:t xml:space="preserve"> tế cho thấy không phải tất cả sản phẩm đều đạt hiệu quả kinh doanh. Một số có doanh số thấp do chưa phù hợp với nhu cầu thị trường, mức giá chưa tối ưu hoặc chưa được tiếp cận đúng tệp khách hàng mục tiêu. </w:t>
       </w:r>
       <w:r>
         <w:t>Có</w:t>
@@ -6342,7 +6371,23 @@
         <w:jc w:val="both"/>
       </w:pPr>
       <w:r>
-        <w:t>Bán cái gì? (Nên đầu tư chạy Ads cho mặt  hàng nào, phân khúc nào đang dễ chốt đơn nhất,..)</w:t>
+        <w:t xml:space="preserve">Bán cái gì? (Nên đầu tư chạy Ads cho </w:t>
+      </w:r>
+      <w:proofErr w:type="gramStart"/>
+      <w:r>
+        <w:t>mặt  hàng</w:t>
+      </w:r>
+      <w:proofErr w:type="gramEnd"/>
+      <w:r>
+        <w:t xml:space="preserve"> nào, phân khúc nào đang dễ chốt đơn </w:t>
+      </w:r>
+      <w:proofErr w:type="gramStart"/>
+      <w:r>
+        <w:t>nhất,..</w:t>
+      </w:r>
+      <w:proofErr w:type="gramEnd"/>
+      <w:r>
+        <w:t>)</w:t>
       </w:r>
     </w:p>
     <w:p>
@@ -6355,7 +6400,23 @@
         <w:jc w:val="both"/>
       </w:pPr>
       <w:r>
-        <w:t>Bán cho ai, ở đâu ? ( Hành vi mua sắm ở các khu vực có khác nhau không?)</w:t>
+        <w:t xml:space="preserve">Bán cho ai, ở </w:t>
+      </w:r>
+      <w:proofErr w:type="gramStart"/>
+      <w:r>
+        <w:t>đâu ?</w:t>
+      </w:r>
+      <w:proofErr w:type="gramEnd"/>
+      <w:r>
+        <w:t xml:space="preserve"> </w:t>
+      </w:r>
+      <w:proofErr w:type="gramStart"/>
+      <w:r>
+        <w:t>( Hành</w:t>
+      </w:r>
+      <w:proofErr w:type="gramEnd"/>
+      <w:r>
+        <w:t xml:space="preserve"> vi mua sắm ở các khu vực có khác nhau không?)</w:t>
       </w:r>
     </w:p>
     <w:p>
@@ -6368,8 +6429,29 @@
         <w:jc w:val="both"/>
       </w:pPr>
       <w:r>
-        <w:t>Dùng chiến lược gì? ( Giảm giá mạnh liệu có tăng  doanh thu, hay khách hàng quan tâm đến số rating hơn? )</w:t>
-      </w:r>
+        <w:t xml:space="preserve">Dùng chiến lược gì? </w:t>
+      </w:r>
+      <w:proofErr w:type="gramStart"/>
+      <w:r>
+        <w:t>( Giảm</w:t>
+      </w:r>
+      <w:proofErr w:type="gramEnd"/>
+      <w:r>
+        <w:t xml:space="preserve"> giá mạnh liệu có </w:t>
+      </w:r>
+      <w:proofErr w:type="gramStart"/>
+      <w:r>
+        <w:t>tăng  doanh</w:t>
+      </w:r>
+      <w:proofErr w:type="gramEnd"/>
+      <w:r>
+        <w:t xml:space="preserve"> thu, hay khách hàng quan tâm đến số rating hơn</w:t>
+      </w:r>
+      <w:proofErr w:type="gramStart"/>
+      <w:r>
+        <w:t>? )</w:t>
+      </w:r>
+      <w:proofErr w:type="gramEnd"/>
     </w:p>
     <w:p>
       <w:pPr>
@@ -6423,7 +6505,15 @@
         </w:numPr>
       </w:pPr>
       <w:r>
-        <w:t>Hỗ trợ trực quan hóa bằng sơ đồ: Các thư viện Pyplot, Seaborn,… của Python</w:t>
+        <w:t xml:space="preserve">Hỗ trợ trực quan hóa bằng sơ đồ: Các thư viện Pyplot, </w:t>
+      </w:r>
+      <w:proofErr w:type="gramStart"/>
+      <w:r>
+        <w:t>Seaborn,…</w:t>
+      </w:r>
+      <w:proofErr w:type="gramEnd"/>
+      <w:r>
+        <w:t xml:space="preserve"> của Python</w:t>
       </w:r>
     </w:p>
     <w:p>
@@ -6857,7 +6947,21 @@
               <w:rPr>
                 <w:szCs w:val="28"/>
               </w:rPr>
-              <w:t>Khai thác và thẩm định tập dữ liệu  từ sàn thương mại điện tử trên nền tảng Kaggle</w:t>
+              <w:t xml:space="preserve">Khai thác và thẩm định tập dữ </w:t>
+            </w:r>
+            <w:proofErr w:type="gramStart"/>
+            <w:r>
+              <w:rPr>
+                <w:szCs w:val="28"/>
+              </w:rPr>
+              <w:t>liệu  từ</w:t>
+            </w:r>
+            <w:proofErr w:type="gramEnd"/>
+            <w:r>
+              <w:rPr>
+                <w:szCs w:val="28"/>
+              </w:rPr>
+              <w:t xml:space="preserve"> sàn thương mại điện tử trên nền tảng Kaggle</w:t>
             </w:r>
           </w:p>
         </w:tc>
@@ -7108,7 +7212,47 @@
                 <w:kern w:val="24"/>
                 <w:szCs w:val="28"/>
               </w:rPr>
-              <w:t>Tiến hành làm sạch ( loại bỏ mặt hàng thừa,….)</w:t>
+              <w:t xml:space="preserve">Tiến hành làm sạch </w:t>
+            </w:r>
+            <w:proofErr w:type="gramStart"/>
+            <w:r>
+              <w:rPr>
+                <w:rFonts w:eastAsia="Arimo Medium"/>
+                <w:color w:val="000000" w:themeColor="text1"/>
+                <w:kern w:val="24"/>
+                <w:szCs w:val="28"/>
+              </w:rPr>
+              <w:t>( loại</w:t>
+            </w:r>
+            <w:proofErr w:type="gramEnd"/>
+            <w:r>
+              <w:rPr>
+                <w:rFonts w:eastAsia="Arimo Medium"/>
+                <w:color w:val="000000" w:themeColor="text1"/>
+                <w:kern w:val="24"/>
+                <w:szCs w:val="28"/>
+              </w:rPr>
+              <w:t xml:space="preserve"> bỏ mặt hàng </w:t>
+            </w:r>
+            <w:proofErr w:type="gramStart"/>
+            <w:r>
+              <w:rPr>
+                <w:rFonts w:eastAsia="Arimo Medium"/>
+                <w:color w:val="000000" w:themeColor="text1"/>
+                <w:kern w:val="24"/>
+                <w:szCs w:val="28"/>
+              </w:rPr>
+              <w:t>thừa,…</w:t>
+            </w:r>
+            <w:proofErr w:type="gramEnd"/>
+            <w:r>
+              <w:rPr>
+                <w:rFonts w:eastAsia="Arimo Medium"/>
+                <w:color w:val="000000" w:themeColor="text1"/>
+                <w:kern w:val="24"/>
+                <w:szCs w:val="28"/>
+              </w:rPr>
+              <w:t>.)</w:t>
             </w:r>
             <w:r>
               <w:rPr>
@@ -8204,11 +8348,16 @@
       <w:r>
         <w:t>Địa chỉ Shop</w:t>
       </w:r>
+      <w:proofErr w:type="gramStart"/>
       <w:r>
         <w:t xml:space="preserve">), </w:t>
       </w:r>
       <w:r>
-        <w:t xml:space="preserve"> name </w:t>
+        <w:t xml:space="preserve"> name</w:t>
+      </w:r>
+      <w:proofErr w:type="gramEnd"/>
+      <w:r>
+        <w:t xml:space="preserve"> </w:t>
       </w:r>
       <w:r>
         <w:t>(</w:t>
@@ -8428,7 +8577,15 @@
         <w:jc w:val="both"/>
       </w:pPr>
       <w:r>
-        <w:t xml:space="preserve">Đây là phần sheet quan trọng trong dự án này, mô tả đầy đủ chi tiết về thông tin bán các sản phẩm điện thoại. Sheet này được sử dụng kết hợp cùng với sheet ID để  tiến hành nghiên cứu dữ liệu. </w:t>
+        <w:t xml:space="preserve">Đây là phần sheet quan trọng trong dự án này, mô tả đầy đủ chi tiết về thông tin bán các sản phẩm điện thoại. Sheet này được sử dụng kết hợp cùng với sheet ID </w:t>
+      </w:r>
+      <w:proofErr w:type="gramStart"/>
+      <w:r>
+        <w:t>để  tiến</w:t>
+      </w:r>
+      <w:proofErr w:type="gramEnd"/>
+      <w:r>
+        <w:t xml:space="preserve"> hành nghiên cứu dữ liệu. </w:t>
       </w:r>
     </w:p>
     <w:p>
@@ -9036,6 +9193,7 @@
       <w:r>
         <w:t xml:space="preserve">Tiến hành chọn lọc thông qua thuộc tính </w:t>
       </w:r>
+      <w:proofErr w:type="gramStart"/>
       <w:r>
         <w:rPr>
           <w:b/>
@@ -9044,7 +9202,19 @@
         <w:t xml:space="preserve">name  </w:t>
       </w:r>
       <w:r>
-        <w:t>bằng cách phân tích chuỗi, nếu như sản phẩm là điện thoại thì giá trị thuộc tính này phải ít nhất chứa chuỗi “điện thoại” hoặc “&lt;hãng : Oppo, Xiaomi &gt;”.</w:t>
+        <w:t>bằng</w:t>
+      </w:r>
+      <w:proofErr w:type="gramEnd"/>
+      <w:r>
+        <w:t xml:space="preserve"> cách phân tích chuỗi, nếu như sản phẩm là điện thoại thì giá trị thuộc tính này phải ít nhất chứa chuỗi “điện thoại” hoặc “&lt;</w:t>
+      </w:r>
+      <w:proofErr w:type="gramStart"/>
+      <w:r>
+        <w:t>hãng :</w:t>
+      </w:r>
+      <w:proofErr w:type="gramEnd"/>
+      <w:r>
+        <w:t xml:space="preserve"> Oppo, Xiaomi &gt;”.</w:t>
       </w:r>
     </w:p>
     <w:p>
@@ -9057,7 +9227,23 @@
         <w:jc w:val="both"/>
       </w:pPr>
       <w:r>
-        <w:t>Tuy nhiên có thể sẽ lòi ra các sản phẩm khác như: Ốp lưng, dây sạc,….. Nhóm tiến hành làm sạch thông qua giá,  giá gốc – original_price &lt; 1 triệu mặc đ</w:t>
+        <w:t xml:space="preserve">Tuy nhiên có thể sẽ lòi ra các sản phẩm khác như: Ốp lưng, dây </w:t>
+      </w:r>
+      <w:proofErr w:type="gramStart"/>
+      <w:r>
+        <w:t>sạc,…</w:t>
+      </w:r>
+      <w:proofErr w:type="gramEnd"/>
+      <w:r>
+        <w:t xml:space="preserve">.. Nhóm tiến hành làm sạch thông qua </w:t>
+      </w:r>
+      <w:proofErr w:type="gramStart"/>
+      <w:r>
+        <w:t>giá,  giá</w:t>
+      </w:r>
+      <w:proofErr w:type="gramEnd"/>
+      <w:r>
+        <w:t xml:space="preserve"> gốc – original_price &lt; 1 triệu mặc đ</w:t>
       </w:r>
       <w:r>
         <w:t xml:space="preserve">ịnh sẽ bị loại bỏ. </w:t>
@@ -9896,13 +10082,45 @@
         <w:t>Phân tích: Dựa vào sơ đồ ta thấy được, ở tập dữ liệu này</w:t>
       </w:r>
       <w:r>
-        <w:t xml:space="preserve"> hiện đang chia ra 2 nửa rõ rệt: Nhóm bán chạy </w:t>
-      </w:r>
-      <w:r>
-        <w:t xml:space="preserve"> ( Xiaomi – khoảng 220000 máy, SamSung –  khoảng 170000 máy, Sony</w:t>
-      </w:r>
-      <w:r>
-        <w:t xml:space="preserve">, LG – khoảng 150000 máy, OPPO – khoảng 100000 máy ) và nhóm bán ế ( Apple, HTC, VIVO, OPPO – khoảng từ 30000 máy trở xuống). Từ đó cho thấy nhóm thị trường đang đua tranh nhau khốc liệt, nhu cấu người dùng càng ngày hướng đến các đặc điểm của dòng máy Xiaomi, SamSung. </w:t>
+        <w:t xml:space="preserve"> hiện đang chia ra 2 nửa rõ rệt: Nhóm bán </w:t>
+      </w:r>
+      <w:proofErr w:type="gramStart"/>
+      <w:r>
+        <w:t xml:space="preserve">chạy </w:t>
+      </w:r>
+      <w:r>
+        <w:t xml:space="preserve"> (</w:t>
+      </w:r>
+      <w:proofErr w:type="gramEnd"/>
+      <w:r>
+        <w:t xml:space="preserve"> Xiaomi – khoảng 220000 máy, SamSung </w:t>
+      </w:r>
+      <w:proofErr w:type="gramStart"/>
+      <w:r>
+        <w:t>–  khoảng</w:t>
+      </w:r>
+      <w:proofErr w:type="gramEnd"/>
+      <w:r>
+        <w:t xml:space="preserve"> 170000 máy, Sony</w:t>
+      </w:r>
+      <w:r>
+        <w:t xml:space="preserve">, LG – khoảng 150000 máy, OPPO – khoảng 100000 </w:t>
+      </w:r>
+      <w:proofErr w:type="gramStart"/>
+      <w:r>
+        <w:t>máy )</w:t>
+      </w:r>
+      <w:proofErr w:type="gramEnd"/>
+      <w:r>
+        <w:t xml:space="preserve"> và nhóm bán ế </w:t>
+      </w:r>
+      <w:proofErr w:type="gramStart"/>
+      <w:r>
+        <w:t>( Apple</w:t>
+      </w:r>
+      <w:proofErr w:type="gramEnd"/>
+      <w:r>
+        <w:t xml:space="preserve">, HTC, VIVO, OPPO – khoảng từ 30000 máy trở xuống). Từ đó cho thấy nhóm thị trường đang đua tranh nhau khốc liệt, nhu cấu người dùng càng ngày hướng đến các đặc điểm của dòng máy Xiaomi, SamSung. </w:t>
       </w:r>
     </w:p>
     <w:p>
@@ -10024,13 +10242,29 @@
         <w:t>Phân tích:  Dựa vào bảng sơ đồ ta thấy được dataset này phần lớn các sản phẩm đều</w:t>
       </w:r>
       <w:r>
-        <w:t xml:space="preserve"> ( khoảng 80 – 120 máy)</w:t>
+        <w:t xml:space="preserve"> </w:t>
+      </w:r>
+      <w:proofErr w:type="gramStart"/>
+      <w:r>
+        <w:t>( khoảng</w:t>
+      </w:r>
+      <w:proofErr w:type="gramEnd"/>
+      <w:r>
+        <w:t xml:space="preserve"> 80 – 120 máy)</w:t>
       </w:r>
       <w:r>
         <w:t xml:space="preserve"> có số lượng bán ra </w:t>
       </w:r>
       <w:r>
-        <w:t>trên dưới 100 máy. Phần kém cạnh hơn (khoảng 40 – 60 máy) có số lượng bán ra trên dưới 1000 máy. Một phần rất nhỏ ( dưới 5 máy) có số lượng bán ra trên dưới 10000 máy. Sơ đồ này phản ánh, s</w:t>
+        <w:t xml:space="preserve">trên dưới 100 máy. Phần kém cạnh hơn (khoảng 40 – 60 máy) có số lượng bán ra trên dưới 1000 máy. Một phần rất nhỏ </w:t>
+      </w:r>
+      <w:proofErr w:type="gramStart"/>
+      <w:r>
+        <w:t>( dưới</w:t>
+      </w:r>
+      <w:proofErr w:type="gramEnd"/>
+      <w:r>
+        <w:t xml:space="preserve"> 5 máy) có số lượng bán ra trên dưới 10000 máy. Sơ đồ này phản ánh, s</w:t>
       </w:r>
       <w:r>
         <w:t>ố lượng mã hàng giảm dần khi sản lượng bán ra tăng cao</w:t>
@@ -10175,7 +10409,15 @@
         <w:t xml:space="preserve">Phân tích: </w:t>
       </w:r>
       <w:r>
-        <w:t xml:space="preserve">Ở sơ đồ này, phần lớn các chấm đang tập trung ở vùng ( số lượng bán </w:t>
+        <w:t xml:space="preserve">Ở sơ đồ này, phần lớn các chấm đang tập trung ở vùng </w:t>
+      </w:r>
+      <w:proofErr w:type="gramStart"/>
+      <w:r>
+        <w:t>( số</w:t>
+      </w:r>
+      <w:proofErr w:type="gramEnd"/>
+      <w:r>
+        <w:t xml:space="preserve"> lượng bán </w:t>
       </w:r>
       <m:oMath>
         <m:r>
@@ -10625,7 +10867,15 @@
     <w:p>
       <w:r>
         <w:tab/>
-        <w:t>Sau khi chạy kết quả, ở phần log, nhóm có lập trình print log để thấy được tỉ lệ thông tin được giữ lại ở mỗi PC, cũng như ở mỗi trục PC thì đại diện cho cái gì ( thuộc tính nào đóng góp nhiều thông tin ở cột PC này nhất – hệ số Loadings):</w:t>
+        <w:t xml:space="preserve">Sau khi chạy kết quả, ở phần log, nhóm có lập trình print log để thấy được tỉ lệ thông tin được giữ lại ở mỗi PC, cũng như ở mỗi trục PC thì đại diện cho cái gì </w:t>
+      </w:r>
+      <w:proofErr w:type="gramStart"/>
+      <w:r>
+        <w:t>( thuộc</w:t>
+      </w:r>
+      <w:proofErr w:type="gramEnd"/>
+      <w:r>
+        <w:t xml:space="preserve"> tính nào đóng góp nhiều thông tin ở cột PC này nhất – hệ số Loadings):</w:t>
       </w:r>
     </w:p>
     <w:p>
@@ -10744,7 +10994,15 @@
         <w:sym w:font="Wingdings" w:char="F0E0"/>
       </w:r>
       <w:r>
-        <w:t xml:space="preserve"> Ở đây ta thấy được PC1 và PC2 giữ lại được tổng 53,8% thông tin gốc. Một con số mặc dù chưa đúng với mong đợi của nhóm ( &gt; 70%), tuy nhiên với dạng dữ liệu 2 chiều PC thì sẽ giúp Kmeans tính toán các cụm dễ hơn. </w:t>
+        <w:t xml:space="preserve"> Ở đây ta thấy được PC1 và PC2 giữ lại được tổng 53,8% thông tin gốc. Một con số mặc dù chưa đúng với mong đợi của nhóm </w:t>
+      </w:r>
+      <w:proofErr w:type="gramStart"/>
+      <w:r>
+        <w:t>( &gt;</w:t>
+      </w:r>
+      <w:proofErr w:type="gramEnd"/>
+      <w:r>
+        <w:t xml:space="preserve"> 70%), tuy nhiên với dạng dữ liệu 2 chiều PC thì sẽ giúp Kmeans tính toán các cụm dễ hơn. </w:t>
       </w:r>
       <w:r>
         <w:t xml:space="preserve"> PC1 thì tỉ lệ thông tin đóng góp nhiều đang phản ảnh 2 cột – discount_price, original_price, cho thấy cột PC này đang nói</w:t>
@@ -10763,7 +11021,23 @@
         <w:t>Phân khúc Giá</w:t>
       </w:r>
       <w:r>
-        <w:t xml:space="preserve">. Tương tự,  PC2 thì nói đến 2 cột  sold_quantity và number_of_ratings, cho thấy cột PC này nói đến </w:t>
+        <w:t xml:space="preserve">. Tương </w:t>
+      </w:r>
+      <w:proofErr w:type="gramStart"/>
+      <w:r>
+        <w:t>tự,  PC</w:t>
+      </w:r>
+      <w:proofErr w:type="gramEnd"/>
+      <w:r>
+        <w:t xml:space="preserve">2 thì nói đến 2 </w:t>
+      </w:r>
+      <w:proofErr w:type="gramStart"/>
+      <w:r>
+        <w:t>cột  sold</w:t>
+      </w:r>
+      <w:proofErr w:type="gramEnd"/>
+      <w:r>
+        <w:t xml:space="preserve">_quantity và number_of_ratings, cho thấy cột PC này nói đến </w:t>
       </w:r>
       <w:r>
         <w:rPr>
@@ -10985,7 +11259,15 @@
         <w:t xml:space="preserve">VD: </w:t>
       </w:r>
       <w:r>
-        <w:t>chấm HaNoi thì gần với chấm Apple, chấm Xiaomi (ví dụ ) --&gt; Các shop ở Hà Nội có xu hướng cháy hàng Apple, Xiaomi,</w:t>
+        <w:t xml:space="preserve">chấm HaNoi thì gần với chấm Apple, chấm Xiaomi (ví </w:t>
+      </w:r>
+      <w:proofErr w:type="gramStart"/>
+      <w:r>
+        <w:t>dụ )</w:t>
+      </w:r>
+      <w:proofErr w:type="gramEnd"/>
+      <w:r>
+        <w:t xml:space="preserve"> --&gt; Các shop ở Hà Nội có xu hướng cháy hàng Apple, Xiaomi,</w:t>
       </w:r>
     </w:p>
     <w:p>
@@ -11057,6 +11339,9 @@
     <w:p>
       <w:pPr>
         <w:pStyle w:val="Caption"/>
+        <w:rPr>
+          <w:lang w:val="vi-VN"/>
+        </w:rPr>
       </w:pPr>
       <w:bookmarkStart w:id="39" w:name="_Toc228206940"/>
       <w:r>
@@ -11113,38 +11398,354 @@
       <w:bookmarkEnd w:id="39"/>
     </w:p>
     <w:p>
-      <w:r>
-        <w:t xml:space="preserve">Phân tích – Vũ phân tích thêm nhé. </w:t>
-      </w:r>
-    </w:p>
-    <w:p>
-      <w:r>
+      <w:pPr>
+        <w:rPr>
+          <w:lang w:val="vi-VN"/>
+        </w:rPr>
+      </w:pPr>
+    </w:p>
+    <w:p>
+      <w:pPr>
+        <w:rPr>
+          <w:lang w:val="vi-VN"/>
+        </w:rPr>
+      </w:pPr>
+    </w:p>
+    <w:p>
+      <w:pPr>
+        <w:rPr>
+          <w:lang w:val="vi-VN"/>
+        </w:rPr>
+      </w:pPr>
+    </w:p>
+    <w:p>
+      <w:pPr>
         <w:rPr>
           <w:b/>
           <w:bCs/>
         </w:rPr>
-        <w:tab/>
-      </w:r>
+      </w:pPr>
       <w:r>
         <w:rPr>
           <w:b/>
           <w:bCs/>
         </w:rPr>
-        <w:t>Kmeans</w:t>
+        <w:lastRenderedPageBreak/>
+        <w:t>Phân Tích Tổng Quan Bản Đồ Tương Quan (Correspondence Analysis - CA)</w:t>
+      </w:r>
+    </w:p>
+    <w:p>
+      <w:pPr>
+        <w:pStyle w:val="NormalWeb"/>
+      </w:pPr>
+      <w:r>
+        <w:t xml:space="preserve">Bản đồ Phân tích Tương quan (CA) được sử dụng để trực quan hóa mối quan hệ giữa hai biến phân loại: </w:t>
       </w:r>
       <w:r>
         <w:rPr>
           <w:b/>
           <w:bCs/>
         </w:rPr>
+        <w:t>Thương hiệu</w:t>
+      </w:r>
+      <w:r>
+        <w:t xml:space="preserve"> (chấm tròn đỏ) và </w:t>
+      </w:r>
+      <w:r>
+        <w:rPr>
+          <w:b/>
+          <w:bCs/>
+        </w:rPr>
+        <w:t>Địa điểm</w:t>
+      </w:r>
+      <w:r>
+        <w:t xml:space="preserve"> (hình vuông xanh). Khoảng cách giữa các điểm trên bản đồ thể hiện mức độ liên kết; các điểm càng nằm gần nhau thì độ tương quan càng cao và ngược lại. Điểm càng gần gốc tọa độ (0,0) cho thấy tính phổ biến chung, ít có sự phân hóa, trong khi các điểm nằm xa tâm (outliers) thể hiện tính đặc thù cao.</w:t>
+      </w:r>
+    </w:p>
+    <w:p>
+      <w:pPr>
+        <w:pStyle w:val="NormalWeb"/>
+      </w:pPr>
+      <w:r>
+        <w:t>Dựa vào sự phân bố trên không gian hai chiều (Dimension 1 và Dimension 2), ta có thể rút ra những nhận định tổng quan sau:</w:t>
+      </w:r>
+    </w:p>
+    <w:p>
+      <w:pPr>
+        <w:pStyle w:val="NormalWeb"/>
+      </w:pPr>
+      <w:r>
+        <w:rPr>
+          <w:b/>
+          <w:bCs/>
+        </w:rPr>
+        <w:t>1. Cụm trung tâm (Thị trường đại chúng &amp; Độ phủ sóng rộng):</w:t>
+      </w:r>
+    </w:p>
+    <w:p>
+      <w:pPr>
+        <w:pStyle w:val="NormalWeb"/>
+        <w:numPr>
+          <w:ilvl w:val="0"/>
+          <w:numId w:val="49"/>
+        </w:numPr>
+      </w:pPr>
+      <w:r>
+        <w:rPr>
+          <w:b/>
+          <w:bCs/>
+        </w:rPr>
+        <w:t>Hiện tượng hội tụ:</w:t>
+      </w:r>
+      <w:r>
+        <w:t xml:space="preserve"> Có thể thấy một cụm tập trung rất dày đặc các Thương hiệu và Địa điểm nằm xoay quanh gốc tọa độ (điểm giao giữa trục ngang 0 và trục dọc 0). Cụm này kéo dài nhẹ sang phía âm của Dimension 1.</w:t>
+      </w:r>
+    </w:p>
+    <w:p>
+      <w:pPr>
+        <w:pStyle w:val="NormalWeb"/>
+        <w:numPr>
+          <w:ilvl w:val="0"/>
+          <w:numId w:val="49"/>
+        </w:numPr>
+      </w:pPr>
+      <w:r>
+        <w:rPr>
+          <w:b/>
+          <w:bCs/>
+        </w:rPr>
+        <w:t>Ý nghĩa:</w:t>
+      </w:r>
+      <w:r>
+        <w:t xml:space="preserve"> Sự dồn nén tại tâm biểu đồ cho thấy phần lớn các thương hiệu (đặc biệt là các thương hiệu phổ thông) không có sự khác biệt quá lớn về mặt địa lý. Chúng được tiêu thụ một cách đại trà và đồng đều tại hầu hết các tỉnh thành phố lõi. Điều này phản ánh tính chất của một thị trường đại chúng, nơi các thương hiệu lớn có độ phủ sóng rộng khắp và hành vi tiêu dùng của khách hàng tại các địa điểm này tương đối giống nhau.</w:t>
+      </w:r>
+    </w:p>
+    <w:p>
+      <w:pPr>
+        <w:pStyle w:val="NormalWeb"/>
+      </w:pPr>
+      <w:r>
+        <w:rPr>
+          <w:b/>
+          <w:bCs/>
+        </w:rPr>
+        <w:t>2. Các phân khúc đặc thù và khu vực ngách (Sự phân hóa thị trường):</w:t>
+      </w:r>
+      <w:r>
+        <w:t xml:space="preserve"> Khi di chuyển ra xa gốc tọa độ, chúng ta bắt đầu thấy sự phân hóa rõ rệt của một số thương hiệu và thị trường địa phương:</w:t>
+      </w:r>
+    </w:p>
+    <w:p>
+      <w:pPr>
+        <w:pStyle w:val="NormalWeb"/>
+        <w:numPr>
+          <w:ilvl w:val="0"/>
+          <w:numId w:val="50"/>
+        </w:numPr>
+      </w:pPr>
+      <w:r>
+        <w:rPr>
+          <w:b/>
+          <w:bCs/>
+        </w:rPr>
+        <w:t>Nhóm hướng Đông Bắc (Góc phần tư thứ 1):</w:t>
+      </w:r>
+      <w:r>
+        <w:t xml:space="preserve"> Các địa điểm như </w:t>
+      </w:r>
+      <w:r>
+        <w:rPr>
+          <w:b/>
+          <w:bCs/>
+        </w:rPr>
+        <w:t>Hưng Yên, Hải Dương, Bắc Ninh</w:t>
+      </w:r>
+      <w:r>
+        <w:t xml:space="preserve"> có sự tách biệt lớn so với cụm trung tâm (đặc biệt là Hưng Yên nằm vươn ra rất xa trên trục Dimension 1). Nằm cùng hướng và có độ tương quan nhất định với khu vực này là thương hiệu </w:t>
+      </w:r>
+      <w:r>
+        <w:rPr>
+          <w:b/>
+          <w:bCs/>
+        </w:rPr>
+        <w:t>Nokia</w:t>
+      </w:r>
+      <w:r>
+        <w:t>. Điều này có thể ngầm định một sự ưu chuộng hoặc mức độ nhận diện riêng biệt của Nokia tại các tỉnh này.</w:t>
+      </w:r>
+    </w:p>
+    <w:p>
+      <w:pPr>
+        <w:pStyle w:val="NormalWeb"/>
+        <w:numPr>
+          <w:ilvl w:val="0"/>
+          <w:numId w:val="50"/>
+        </w:numPr>
+      </w:pPr>
+      <w:r>
+        <w:rPr>
+          <w:b/>
+          <w:bCs/>
+        </w:rPr>
+        <w:t>Nhóm hướng Bắc (Phía trên trục dọc):</w:t>
+      </w:r>
+      <w:r>
+        <w:t xml:space="preserve"> Các thương hiệu như </w:t>
+      </w:r>
+      <w:r>
+        <w:rPr>
+          <w:b/>
+          <w:bCs/>
+        </w:rPr>
+        <w:t>Mobiistar, Itel</w:t>
+      </w:r>
+      <w:r>
+        <w:t xml:space="preserve"> có chỉ số Dimension 2 cao. Địa điểm nằm gần cụm này nhất là </w:t>
+      </w:r>
+      <w:proofErr w:type="gramStart"/>
+      <w:r>
+        <w:rPr>
+          <w:b/>
+          <w:bCs/>
+        </w:rPr>
+        <w:t>An</w:t>
+      </w:r>
+      <w:proofErr w:type="gramEnd"/>
+      <w:r>
+        <w:rPr>
+          <w:b/>
+          <w:bCs/>
+        </w:rPr>
+        <w:t xml:space="preserve"> Giang</w:t>
+      </w:r>
+      <w:r>
+        <w:t>. Đây có thể là dấu hiệu cho thấy các dòng điện thoại giá rẻ/cơ bản này có sự liên kết tốt hơn với một số thị trường tỉnh lẻ nhất định.</w:t>
+      </w:r>
+    </w:p>
+    <w:p>
+      <w:pPr>
+        <w:pStyle w:val="NormalWeb"/>
+        <w:numPr>
+          <w:ilvl w:val="0"/>
+          <w:numId w:val="50"/>
+        </w:numPr>
+      </w:pPr>
+      <w:r>
+        <w:rPr>
+          <w:b/>
+          <w:bCs/>
+        </w:rPr>
+        <w:t>Nhóm hướng Nam (Nửa dưới biểu đồ):</w:t>
+      </w:r>
+      <w:r>
+        <w:t xml:space="preserve"> Khu vực này tập trung các thương hiệu như </w:t>
+      </w:r>
+      <w:r>
+        <w:rPr>
+          <w:b/>
+          <w:bCs/>
+        </w:rPr>
+        <w:t>Huawei, Meizu</w:t>
+      </w:r>
+      <w:r>
+        <w:t xml:space="preserve"> cùng với một số địa điểm như </w:t>
+      </w:r>
+      <w:r>
+        <w:rPr>
+          <w:b/>
+          <w:bCs/>
+        </w:rPr>
+        <w:t>Nghệ An, Hà Tĩnh, Yên Bái</w:t>
+      </w:r>
+      <w:r>
+        <w:t>. Sự phân bố này cho thấy thị hiếu của người tiêu dùng tại các khu vực này có sự tương đồng và có sự quan tâm nhất định đến các thương hiệu điện thoại Trung Quốc này.</w:t>
+      </w:r>
+    </w:p>
+    <w:p>
+      <w:pPr>
+        <w:pStyle w:val="NormalWeb"/>
+        <w:numPr>
+          <w:ilvl w:val="0"/>
+          <w:numId w:val="50"/>
+        </w:numPr>
+      </w:pPr>
+      <w:r>
+        <w:rPr>
+          <w:b/>
+          <w:bCs/>
+        </w:rPr>
+        <w:t>Thương hiệu đứng độc lập:</w:t>
+      </w:r>
+      <w:r>
+        <w:t xml:space="preserve"> Thương hiệu </w:t>
+      </w:r>
+      <w:r>
+        <w:rPr>
+          <w:b/>
+          <w:bCs/>
+        </w:rPr>
+        <w:t>FPT</w:t>
+      </w:r>
+      <w:r>
+        <w:t xml:space="preserve"> nằm tách biệt hoàn toàn về phía âm cực đại của trục Dimension 1, không gắn kết chặt chẽ với một địa điểm cụ thể nào trên bản đồ, cho thấy một vị thế hoặc định vị khách hàng rất khác biệt so với phần còn lại của thị trường.</w:t>
+      </w:r>
+    </w:p>
+    <w:p>
+      <w:pPr>
+        <w:pStyle w:val="NormalWeb"/>
+      </w:pPr>
+      <w:r>
+        <w:rPr>
+          <w:b/>
+          <w:bCs/>
+        </w:rPr>
+        <w:t>Kết luận chung:</w:t>
+      </w:r>
+      <w:r>
+        <w:t xml:space="preserve"> Nhìn tổng thể, thị trường điện thoại (hoặc thiết bị điện tử) đang được phân chia thành hai trạng thái rõ rệt: Một "vùng đỏ" tại trung tâm nơi cạnh tranh khốc liệt trên diện rộng không phân biệt ranh giới địa lý, và những "vùng rìa" nơi có sự liên kết ngầm giữa một vài thương hiệu mang tính ngách (như Mobiistar, Nokia, Huawei) với các đặc điểm tiêu dùng/thu nhập của từng tỉnh thành cụ thể (như Hưng Yên, Bắc Ninh, Nghệ An).</w:t>
+      </w:r>
+    </w:p>
+    <w:p>
+      <w:r>
+        <w:rPr>
+          <w:b/>
+          <w:bCs/>
+        </w:rPr>
+        <w:lastRenderedPageBreak/>
+        <w:tab/>
+      </w:r>
+      <w:r>
+        <w:rPr>
+          <w:b/>
+          <w:bCs/>
+        </w:rPr>
+        <w:t>Kmeans</w:t>
+      </w:r>
+      <w:r>
+        <w:rPr>
+          <w:b/>
+          <w:bCs/>
+        </w:rPr>
         <w:t xml:space="preserve">: </w:t>
       </w:r>
       <w:r>
-        <w:t xml:space="preserve">Dữ liệu chưa có nhãn quyết định nên cần gom nhóm dữ liệu Kmeans để có thể chia ra các nhóm gồm các chấm có đặc tính tương quan nhau. ( </w:t>
-      </w:r>
-      <w:r>
-        <w:lastRenderedPageBreak/>
-        <w:t>Các điểm đại diện trong 1 cụm càng gần nhau càng tốt) các cụm càng tách xa ra thì mô hình phân cụm tốt. Ở dự án này Kmeans được sử dụng để gom cụm dựa trên 2 biến PC1 và PC2 ở quá trình giảm chiều dữ liệu, sau khi gom cụm, kết quả trực quan kmeans được kết hợp với kết quả trực quan của CA  để hỗ trợ quyết định marketing cụ thể.</w:t>
+        <w:t xml:space="preserve">Dữ liệu chưa có nhãn quyết định nên cần gom nhóm dữ liệu Kmeans để có thể chia ra các nhóm gồm các chấm có đặc tính tương quan nhau. </w:t>
+      </w:r>
+      <w:proofErr w:type="gramStart"/>
+      <w:r>
+        <w:t>( Các</w:t>
+      </w:r>
+      <w:proofErr w:type="gramEnd"/>
+      <w:r>
+        <w:t xml:space="preserve"> điểm đại diện trong 1 cụm càng gần nhau càng tốt) các cụm càng tách xa ra thì mô hình phân cụm tốt. Ở dự án này Kmeans được sử dụng để gom cụm dựa trên 2 biến PC1 và PC2 ở quá trình giảm chiều dữ liệu, sau khi gom cụm, kết quả trực quan kmeans được kết hợp với kết quả trực quan của </w:t>
+      </w:r>
+      <w:proofErr w:type="gramStart"/>
+      <w:r>
+        <w:t>CA  để</w:t>
+      </w:r>
+      <w:proofErr w:type="gramEnd"/>
+      <w:r>
+        <w:t xml:space="preserve"> hỗ trợ quyết định marketing cụ thể.</w:t>
       </w:r>
     </w:p>
     <w:p>
@@ -11273,6 +11874,7 @@
         <w:rPr>
           <w:noProof/>
         </w:rPr>
+        <w:lastRenderedPageBreak/>
         <w:drawing>
           <wp:inline distT="0" distB="0" distL="0" distR="0" wp14:anchorId="3BF701A2" wp14:editId="44ECC58B">
             <wp:extent cx="5940425" cy="2970530"/>
@@ -11382,26 +11984,59 @@
         </w:numPr>
       </w:pPr>
       <w:r>
-        <w:lastRenderedPageBreak/>
         <w:sym w:font="Wingdings" w:char="F0E0"/>
       </w:r>
       <w:r>
         <w:t xml:space="preserve"> Nhóm đang phân vân giữa 2 giá trị cụm là 2 và 3. Mặc dù ở </w:t>
       </w:r>
       <w:r>
-        <w:t xml:space="preserve">2 phương pháp xác định số cụm, giá trị K = 2 có tính vượt trội hơn về Độ biến thiên ( Elbow) cũng như Sithouette Score so với K = 3. Tuy nhiên xét về mục đích của bài toán dữ liệu, nếu như nhóm chỉ phân cụm 2 nhóm thì đặc điểm cụm sẽ rất hạn chế, vd: </w:t>
-      </w:r>
-      <w:r>
-        <w:t>( giá rẻ bán chạy - giá cao bán ế )</w:t>
-      </w:r>
+        <w:t xml:space="preserve">2 phương pháp xác định số cụm, giá trị K = 2 có tính vượt trội hơn về Độ biến thiên </w:t>
+      </w:r>
+      <w:proofErr w:type="gramStart"/>
+      <w:r>
+        <w:t>( Elbow</w:t>
+      </w:r>
+      <w:proofErr w:type="gramEnd"/>
+      <w:r>
+        <w:t xml:space="preserve">) cũng như Sithouette Score so với K = 3. Tuy nhiên xét về mục đích của bài toán dữ liệu, nếu như nhóm chỉ phân cụm 2 nhóm thì đặc điểm cụm sẽ rất hạn chế, vd: </w:t>
+      </w:r>
+      <w:proofErr w:type="gramStart"/>
+      <w:r>
+        <w:t>( giá</w:t>
+      </w:r>
+      <w:proofErr w:type="gramEnd"/>
+      <w:r>
+        <w:t xml:space="preserve"> rẻ bán chạy - giá cao bán </w:t>
+      </w:r>
+      <w:proofErr w:type="gramStart"/>
+      <w:r>
+        <w:t>ế )</w:t>
+      </w:r>
+      <w:proofErr w:type="gramEnd"/>
       <w:r>
         <w:t xml:space="preserve">. Với </w:t>
       </w:r>
       <w:r>
-        <w:t>K = 3 : Mô hình phân cụm linh hoạt hơn (</w:t>
-      </w:r>
-      <w:r>
-        <w:t xml:space="preserve"> vd: </w:t>
+        <w:t xml:space="preserve">K = </w:t>
+      </w:r>
+      <w:proofErr w:type="gramStart"/>
+      <w:r>
+        <w:t>3 :</w:t>
+      </w:r>
+      <w:proofErr w:type="gramEnd"/>
+      <w:r>
+        <w:t xml:space="preserve"> Mô hình phân cụm linh hoạt hơn </w:t>
+      </w:r>
+      <w:proofErr w:type="gramStart"/>
+      <w:r>
+        <w:t>(</w:t>
+      </w:r>
+      <w:r>
+        <w:t xml:space="preserve"> vd</w:t>
+      </w:r>
+      <w:proofErr w:type="gramEnd"/>
+      <w:r>
+        <w:t xml:space="preserve">: </w:t>
       </w:r>
       <w:r>
         <w:t xml:space="preserve"> Phân khúc Thấp – Trung Bình – Cao (flagship)</w:t>
@@ -11419,6 +12054,7 @@
         <w:rPr>
           <w:noProof/>
         </w:rPr>
+        <w:lastRenderedPageBreak/>
         <w:drawing>
           <wp:inline distT="0" distB="0" distL="0" distR="0" wp14:anchorId="33108386" wp14:editId="325FB37B">
             <wp:extent cx="5940425" cy="4158615"/>
@@ -11532,7 +12168,15 @@
         <w:t xml:space="preserve">Nhìn vào sơ đồ ta thấy được dữ liệu đang được chia thành 3 cụm 0 – xanh dương, 1 – cam, 2 – xanh lục. </w:t>
       </w:r>
       <w:r>
-        <w:t xml:space="preserve">Sau khi xác định được rạnh giới các cụm, nhóm sử dụng phép toán “Aggregated Mean “ – tính trung bình gộp. </w:t>
+        <w:t xml:space="preserve">Sau khi xác định được rạnh giới các cụm, nhóm sử dụng phép toán “Aggregated Mean </w:t>
+      </w:r>
+      <w:proofErr w:type="gramStart"/>
+      <w:r>
+        <w:t>“ –</w:t>
+      </w:r>
+      <w:proofErr w:type="gramEnd"/>
+      <w:r>
+        <w:t xml:space="preserve"> tính trung bình gộp. </w:t>
       </w:r>
       <w:r>
         <w:sym w:font="Wingdings" w:char="F0E0"/>
@@ -11664,7 +12308,6 @@
           <w:b/>
           <w:bCs/>
         </w:rPr>
-        <w:lastRenderedPageBreak/>
         <w:t xml:space="preserve">Cụm 0 </w:t>
       </w:r>
       <w:r>
@@ -11697,6 +12340,7 @@
         <w:jc w:val="both"/>
       </w:pPr>
       <w:r>
+        <w:lastRenderedPageBreak/>
         <w:t>Đây là nhóm "sản phẩm mồi". Khách hàng mua nhóm này rất nhạy cảm về giá và ra quyết định dựa trên các chương trình khuyến mãi. Việc điểm sao thấp nhất cho thấy ở mức giá này, người dùng có thể gặp một số vấn đề về kỳ vọng hoặc dịch vụ hậu mãi.</w:t>
       </w:r>
     </w:p>
@@ -11901,7 +12545,6 @@
           <w:b/>
           <w:bCs/>
         </w:rPr>
-        <w:lastRenderedPageBreak/>
         <w:t>Cụm 2</w:t>
       </w:r>
       <w:r>
@@ -11937,6 +12580,7 @@
         <w:jc w:val="both"/>
       </w:pPr>
       <w:r>
+        <w:lastRenderedPageBreak/>
         <w:t xml:space="preserve">Nhóm này có thể là các sản phẩm kén người mua hoặc là sản phẩm mới lên sàn, chưa có nhiều độ phủ nên số lượng bán và rating chưa cao. Tuy nhiên, chất lượng lõi </w:t>
       </w:r>
       <w:r>
@@ -11983,14 +12627,20 @@
           <w:numId w:val="48"/>
         </w:numPr>
         <w:jc w:val="both"/>
-      </w:pPr>
-      <w:r>
         <w:rPr>
           <w:lang w:val="vi-VN"/>
         </w:rPr>
+      </w:pPr>
+      <w:r>
+        <w:rPr>
+          <w:lang w:val="vi-VN"/>
+        </w:rPr>
         <w:t xml:space="preserve">"Lấy số lượng đè chất lượng". </w:t>
       </w:r>
       <w:r>
+        <w:rPr>
+          <w:lang w:val="vi-VN"/>
+        </w:rPr>
         <w:t>Không nên</w:t>
       </w:r>
       <w:r>
@@ -12000,9 +12650,15 @@
         <w:t xml:space="preserve"> tốn tiền chạy Ads thương hiệu, hãy tập trung vào SEO từ khóa "điện thoại giá rẻ"</w:t>
       </w:r>
       <w:r>
+        <w:rPr>
+          <w:lang w:val="vi-VN"/>
+        </w:rPr>
         <w:t xml:space="preserve">. </w:t>
       </w:r>
       <w:r>
+        <w:rPr>
+          <w:lang w:val="vi-VN"/>
+        </w:rPr>
         <w:t>Tăng cường đấu thầu từ khóa và quảng cáo Khám phá để tăng lượt hiển thị cho nhóm này, giúp sản phẩm tiếp cận đúng tệp khách hàng mục tiêu.</w:t>
       </w:r>
     </w:p>
@@ -12014,26 +12670,49 @@
           <w:numId w:val="48"/>
         </w:numPr>
         <w:jc w:val="both"/>
-      </w:pPr>
-      <w:r>
+        <w:rPr>
+          <w:lang w:val="vi-VN"/>
+        </w:rPr>
+      </w:pPr>
+      <w:r>
+        <w:rPr>
+          <w:lang w:val="vi-VN"/>
+        </w:rPr>
         <w:t>Tạo Combo: Ghép cặp cụm 2 với các sản phẩm hot ở Cụm 0. Ví dụ: "Mua sản phẩm (Cụm 0) để được giảm ngay 30% cho sản phẩm (Cụm 2)".</w:t>
       </w:r>
     </w:p>
     <w:p>
       <w:pPr>
         <w:pStyle w:val="Heading3"/>
+        <w:rPr>
+          <w:lang w:val="vi-VN"/>
+        </w:rPr>
       </w:pPr>
       <w:bookmarkStart w:id="44" w:name="_Toc228512030"/>
       <w:r>
+        <w:rPr>
+          <w:lang w:val="vi-VN"/>
+        </w:rPr>
         <w:t>Huấn luyện mô hình AI dự đoán và kiểm thử</w:t>
       </w:r>
       <w:bookmarkEnd w:id="44"/>
     </w:p>
     <w:p>
-      <w:r>
+      <w:pPr>
+        <w:rPr>
+          <w:lang w:val="vi-VN"/>
+        </w:rPr>
+      </w:pPr>
+      <w:r>
+        <w:rPr>
+          <w:lang w:val="vi-VN"/>
+        </w:rPr>
         <w:tab/>
       </w:r>
       <w:r>
+        <w:rPr>
+          <w:lang w:val="vi-VN"/>
+        </w:rPr>
         <w:t xml:space="preserve">Mô hình huấn luyện được sử dụng: Dựa vào nhu cầu của dự án, nhóm quyết chọn mô hình Random Forest bởi: </w:t>
       </w:r>
     </w:p>
@@ -12045,8 +12724,14 @@
           <w:numId w:val="32"/>
         </w:numPr>
         <w:jc w:val="both"/>
-      </w:pPr>
-      <w:r>
+        <w:rPr>
+          <w:lang w:val="vi-VN"/>
+        </w:rPr>
+      </w:pPr>
+      <w:r>
+        <w:rPr>
+          <w:lang w:val="vi-VN"/>
+        </w:rPr>
         <w:t>Random forest là m</w:t>
       </w:r>
       <w:r>
@@ -12064,14 +12749,20 @@
           <w:numId w:val="32"/>
         </w:numPr>
         <w:jc w:val="both"/>
-      </w:pPr>
-      <w:r>
         <w:rPr>
           <w:lang w:val="vi-VN"/>
         </w:rPr>
+      </w:pPr>
+      <w:r>
+        <w:rPr>
+          <w:lang w:val="vi-VN"/>
+        </w:rPr>
         <w:t>Chuyên trị dữ liệu</w:t>
       </w:r>
       <w:r>
+        <w:rPr>
+          <w:lang w:val="vi-VN"/>
+        </w:rPr>
         <w:t xml:space="preserve"> dạng</w:t>
       </w:r>
       <w:r>
@@ -12081,6 +12772,9 @@
         <w:t xml:space="preserve"> bản</w:t>
       </w:r>
       <w:r>
+        <w:rPr>
+          <w:lang w:val="vi-VN"/>
+        </w:rPr>
         <w:t>g</w:t>
       </w:r>
     </w:p>
@@ -12092,6 +12786,9 @@
           <w:numId w:val="32"/>
         </w:numPr>
         <w:jc w:val="both"/>
+        <w:rPr>
+          <w:lang w:val="vi-VN"/>
+        </w:rPr>
       </w:pPr>
       <w:r>
         <w:rPr>
@@ -12108,6 +12805,9 @@
           <w:numId w:val="32"/>
         </w:numPr>
         <w:jc w:val="both"/>
+        <w:rPr>
+          <w:lang w:val="vi-VN"/>
+        </w:rPr>
       </w:pPr>
       <w:r>
         <w:rPr>
@@ -12334,10 +13034,26 @@
         </w:numPr>
       </w:pPr>
       <w:r>
-        <w:t>Chia tập train / test theo tỉ lệ 80 : 20</w:t>
-      </w:r>
-      <w:r>
-        <w:t xml:space="preserve"> và 70 : 30, sau đó lấy mô hình tối ưu hơn </w:t>
+        <w:t xml:space="preserve">Chia tập train / test theo tỉ lệ </w:t>
+      </w:r>
+      <w:proofErr w:type="gramStart"/>
+      <w:r>
+        <w:t>80 :</w:t>
+      </w:r>
+      <w:proofErr w:type="gramEnd"/>
+      <w:r>
+        <w:t xml:space="preserve"> 20</w:t>
+      </w:r>
+      <w:r>
+        <w:t xml:space="preserve"> và </w:t>
+      </w:r>
+      <w:proofErr w:type="gramStart"/>
+      <w:r>
+        <w:t>70 :</w:t>
+      </w:r>
+      <w:proofErr w:type="gramEnd"/>
+      <w:r>
+        <w:t xml:space="preserve"> 30, sau đó lấy mô hình tối ưu hơn </w:t>
       </w:r>
     </w:p>
     <w:p>
@@ -12577,7 +13293,15 @@
         <w:t xml:space="preserve">phân cụm khá ổn, đặc điệt hiệu quả cao với cụm 2. </w:t>
       </w:r>
       <w:r>
-        <w:t xml:space="preserve"> Mô hình nhận diện các sản phẩm cụm 0 và 1 ở mức khá ổn. Tỉ lệ dự đoán sai các trường hợp không nhiều ( 46/493 TH ~ 9.3%). </w:t>
+        <w:t xml:space="preserve"> Mô hình nhận diện các sản phẩm cụm 0 và 1 ở mức khá ổn. Tỉ lệ dự đoán sai các trường hợp không nhiều </w:t>
+      </w:r>
+      <w:proofErr w:type="gramStart"/>
+      <w:r>
+        <w:t>( 46</w:t>
+      </w:r>
+      <w:proofErr w:type="gramEnd"/>
+      <w:r>
+        <w:t xml:space="preserve">/493 TH ~ 9.3%). </w:t>
       </w:r>
     </w:p>
     <w:p>
@@ -12847,7 +13571,15 @@
     <w:p>
       <w:r>
         <w:tab/>
-        <w:t xml:space="preserve">Triển khai UI và  kiểm thử dự đoán của mô hình: </w:t>
+        <w:t xml:space="preserve">Triển khai UI </w:t>
+      </w:r>
+      <w:proofErr w:type="gramStart"/>
+      <w:r>
+        <w:t>và  kiểm</w:t>
+      </w:r>
+      <w:proofErr w:type="gramEnd"/>
+      <w:r>
+        <w:t xml:space="preserve"> thử dự đoán của mô hình: </w:t>
       </w:r>
     </w:p>
     <w:p>
@@ -12862,6 +13594,9 @@
         <w:jc w:val="center"/>
       </w:pPr>
       <w:r>
+        <w:rPr>
+          <w:noProof/>
+        </w:rPr>
         <w:drawing>
           <wp:inline distT="0" distB="0" distL="0" distR="0" wp14:anchorId="6C373509" wp14:editId="120C9A3D">
             <wp:extent cx="5940425" cy="2399665"/>
@@ -12963,6 +13698,9 @@
         <w:jc w:val="center"/>
       </w:pPr>
       <w:r>
+        <w:rPr>
+          <w:noProof/>
+        </w:rPr>
         <w:drawing>
           <wp:inline distT="0" distB="0" distL="0" distR="0" wp14:anchorId="53F0DE8F" wp14:editId="4B5F1DDA">
             <wp:extent cx="5940425" cy="2379980"/>
@@ -13064,6 +13802,9 @@
         <w:jc w:val="center"/>
       </w:pPr>
       <w:r>
+        <w:rPr>
+          <w:noProof/>
+        </w:rPr>
         <w:drawing>
           <wp:inline distT="0" distB="0" distL="0" distR="0" wp14:anchorId="199F3614" wp14:editId="6CF02B06">
             <wp:extent cx="6056298" cy="2489200"/>
@@ -13280,11 +14021,14 @@
           <w:ilvl w:val="0"/>
           <w:numId w:val="38"/>
         </w:numPr>
-      </w:pPr>
-      <w:r>
         <w:rPr>
           <w:lang w:val="vi-VN"/>
         </w:rPr>
+      </w:pPr>
+      <w:r>
+        <w:rPr>
+          <w:lang w:val="vi-VN"/>
+        </w:rPr>
         <w:t>Mở rộng bộ dữ liệu</w:t>
       </w:r>
       <w:r>
@@ -13297,6 +14041,9 @@
         <w:t>Tập dữ liệu hiện tại chủ yếu tập trung mạnh ở phân khúc dưới 15 triệu. Để AI dự báo sắc nét hơn cần cào them</w:t>
       </w:r>
       <w:r>
+        <w:rPr>
+          <w:lang w:val="vi-VN"/>
+        </w:rPr>
         <w:t xml:space="preserve"> nhiều</w:t>
       </w:r>
       <w:r>
@@ -13306,6 +14053,9 @@
         <w:t xml:space="preserve"> dữ liệu </w:t>
       </w:r>
       <w:r>
+        <w:rPr>
+          <w:lang w:val="vi-VN"/>
+        </w:rPr>
         <w:t>hơn.</w:t>
       </w:r>
     </w:p>
@@ -13316,14 +14066,20 @@
           <w:ilvl w:val="0"/>
           <w:numId w:val="38"/>
         </w:numPr>
-      </w:pPr>
-      <w:r>
         <w:rPr>
           <w:lang w:val="vi-VN"/>
         </w:rPr>
+      </w:pPr>
+      <w:r>
+        <w:rPr>
+          <w:lang w:val="vi-VN"/>
+        </w:rPr>
         <w:t xml:space="preserve">Thiếu phân tích Cảm xúc: Hiện tại nhóm </w:t>
       </w:r>
       <w:r>
+        <w:rPr>
+          <w:lang w:val="vi-VN"/>
+        </w:rPr>
         <w:t xml:space="preserve">chưa thể </w:t>
       </w:r>
       <w:r>
@@ -13333,6 +14089,9 @@
         <w:t xml:space="preserve">chạy các mô hình NLP (Xử lý ngôn ngữ tự nhiên), giúp hiểu rõ khách hàng chê máy Cụm </w:t>
       </w:r>
       <w:r>
+        <w:rPr>
+          <w:lang w:val="vi-VN"/>
+        </w:rPr>
         <w:t>1</w:t>
       </w:r>
       <w:r>
@@ -13342,19 +14101,45 @@
         <w:t xml:space="preserve"> ở điểm nào (camera, pin, hay thái độ shop)</w:t>
       </w:r>
       <w:r>
+        <w:rPr>
+          <w:lang w:val="vi-VN"/>
+        </w:rPr>
         <w:t>, từ đó có những kế hoạch marketing tốt hơn.</w:t>
       </w:r>
     </w:p>
-    <w:p/>
-    <w:p/>
-    <w:p>
-      <w:r>
+    <w:p>
+      <w:pPr>
+        <w:rPr>
+          <w:lang w:val="vi-VN"/>
+        </w:rPr>
+      </w:pPr>
+    </w:p>
+    <w:p>
+      <w:pPr>
+        <w:rPr>
+          <w:lang w:val="vi-VN"/>
+        </w:rPr>
+      </w:pPr>
+    </w:p>
+    <w:p>
+      <w:pPr>
+        <w:rPr>
+          <w:lang w:val="vi-VN"/>
+        </w:rPr>
+      </w:pPr>
+      <w:r>
+        <w:rPr>
+          <w:lang w:val="vi-VN"/>
+        </w:rPr>
         <w:br w:type="page"/>
       </w:r>
     </w:p>
     <w:p>
       <w:pPr>
         <w:jc w:val="center"/>
+        <w:rPr>
+          <w:lang w:val="vi-VN"/>
+        </w:rPr>
       </w:pPr>
     </w:p>
     <w:p>
@@ -14583,6 +15368,155 @@
     </w:lvl>
   </w:abstractNum>
   <w:abstractNum w:abstractNumId="8" w15:restartNumberingAfterBreak="0">
+    <w:nsid w:val="20EF27A4"/>
+    <w:multiLevelType w:val="multilevel"/>
+    <w:tmpl w:val="0B565BFC"/>
+    <w:lvl w:ilvl="0">
+      <w:start w:val="1"/>
+      <w:numFmt w:val="bullet"/>
+      <w:lvlText w:val=""/>
+      <w:lvlJc w:val="left"/>
+      <w:pPr>
+        <w:tabs>
+          <w:tab w:val="num" w:pos="720"/>
+        </w:tabs>
+        <w:ind w:left="720" w:hanging="360"/>
+      </w:pPr>
+      <w:rPr>
+        <w:rFonts w:ascii="Symbol" w:hAnsi="Symbol" w:hint="default"/>
+        <w:sz w:val="20"/>
+      </w:rPr>
+    </w:lvl>
+    <w:lvl w:ilvl="1" w:tentative="1">
+      <w:start w:val="1"/>
+      <w:numFmt w:val="bullet"/>
+      <w:lvlText w:val="o"/>
+      <w:lvlJc w:val="left"/>
+      <w:pPr>
+        <w:tabs>
+          <w:tab w:val="num" w:pos="1440"/>
+        </w:tabs>
+        <w:ind w:left="1440" w:hanging="360"/>
+      </w:pPr>
+      <w:rPr>
+        <w:rFonts w:ascii="Courier New" w:hAnsi="Courier New" w:hint="default"/>
+        <w:sz w:val="20"/>
+      </w:rPr>
+    </w:lvl>
+    <w:lvl w:ilvl="2" w:tentative="1">
+      <w:start w:val="1"/>
+      <w:numFmt w:val="bullet"/>
+      <w:lvlText w:val=""/>
+      <w:lvlJc w:val="left"/>
+      <w:pPr>
+        <w:tabs>
+          <w:tab w:val="num" w:pos="2160"/>
+        </w:tabs>
+        <w:ind w:left="2160" w:hanging="360"/>
+      </w:pPr>
+      <w:rPr>
+        <w:rFonts w:ascii="Wingdings" w:hAnsi="Wingdings" w:hint="default"/>
+        <w:sz w:val="20"/>
+      </w:rPr>
+    </w:lvl>
+    <w:lvl w:ilvl="3" w:tentative="1">
+      <w:start w:val="1"/>
+      <w:numFmt w:val="bullet"/>
+      <w:lvlText w:val=""/>
+      <w:lvlJc w:val="left"/>
+      <w:pPr>
+        <w:tabs>
+          <w:tab w:val="num" w:pos="2880"/>
+        </w:tabs>
+        <w:ind w:left="2880" w:hanging="360"/>
+      </w:pPr>
+      <w:rPr>
+        <w:rFonts w:ascii="Wingdings" w:hAnsi="Wingdings" w:hint="default"/>
+        <w:sz w:val="20"/>
+      </w:rPr>
+    </w:lvl>
+    <w:lvl w:ilvl="4" w:tentative="1">
+      <w:start w:val="1"/>
+      <w:numFmt w:val="bullet"/>
+      <w:lvlText w:val=""/>
+      <w:lvlJc w:val="left"/>
+      <w:pPr>
+        <w:tabs>
+          <w:tab w:val="num" w:pos="3600"/>
+        </w:tabs>
+        <w:ind w:left="3600" w:hanging="360"/>
+      </w:pPr>
+      <w:rPr>
+        <w:rFonts w:ascii="Wingdings" w:hAnsi="Wingdings" w:hint="default"/>
+        <w:sz w:val="20"/>
+      </w:rPr>
+    </w:lvl>
+    <w:lvl w:ilvl="5" w:tentative="1">
+      <w:start w:val="1"/>
+      <w:numFmt w:val="bullet"/>
+      <w:lvlText w:val=""/>
+      <w:lvlJc w:val="left"/>
+      <w:pPr>
+        <w:tabs>
+          <w:tab w:val="num" w:pos="4320"/>
+        </w:tabs>
+        <w:ind w:left="4320" w:hanging="360"/>
+      </w:pPr>
+      <w:rPr>
+        <w:rFonts w:ascii="Wingdings" w:hAnsi="Wingdings" w:hint="default"/>
+        <w:sz w:val="20"/>
+      </w:rPr>
+    </w:lvl>
+    <w:lvl w:ilvl="6" w:tentative="1">
+      <w:start w:val="1"/>
+      <w:numFmt w:val="bullet"/>
+      <w:lvlText w:val=""/>
+      <w:lvlJc w:val="left"/>
+      <w:pPr>
+        <w:tabs>
+          <w:tab w:val="num" w:pos="5040"/>
+        </w:tabs>
+        <w:ind w:left="5040" w:hanging="360"/>
+      </w:pPr>
+      <w:rPr>
+        <w:rFonts w:ascii="Wingdings" w:hAnsi="Wingdings" w:hint="default"/>
+        <w:sz w:val="20"/>
+      </w:rPr>
+    </w:lvl>
+    <w:lvl w:ilvl="7" w:tentative="1">
+      <w:start w:val="1"/>
+      <w:numFmt w:val="bullet"/>
+      <w:lvlText w:val=""/>
+      <w:lvlJc w:val="left"/>
+      <w:pPr>
+        <w:tabs>
+          <w:tab w:val="num" w:pos="5760"/>
+        </w:tabs>
+        <w:ind w:left="5760" w:hanging="360"/>
+      </w:pPr>
+      <w:rPr>
+        <w:rFonts w:ascii="Wingdings" w:hAnsi="Wingdings" w:hint="default"/>
+        <w:sz w:val="20"/>
+      </w:rPr>
+    </w:lvl>
+    <w:lvl w:ilvl="8" w:tentative="1">
+      <w:start w:val="1"/>
+      <w:numFmt w:val="bullet"/>
+      <w:lvlText w:val=""/>
+      <w:lvlJc w:val="left"/>
+      <w:pPr>
+        <w:tabs>
+          <w:tab w:val="num" w:pos="6480"/>
+        </w:tabs>
+        <w:ind w:left="6480" w:hanging="360"/>
+      </w:pPr>
+      <w:rPr>
+        <w:rFonts w:ascii="Wingdings" w:hAnsi="Wingdings" w:hint="default"/>
+        <w:sz w:val="20"/>
+      </w:rPr>
+    </w:lvl>
+  </w:abstractNum>
+  <w:abstractNum w:abstractNumId="9" w15:restartNumberingAfterBreak="0">
     <w:nsid w:val="250E531C"/>
     <w:multiLevelType w:val="hybridMultilevel"/>
     <w:tmpl w:val="3E1893E6"/>
@@ -14695,7 +15629,7 @@
       </w:rPr>
     </w:lvl>
   </w:abstractNum>
-  <w:abstractNum w:abstractNumId="9" w15:restartNumberingAfterBreak="0">
+  <w:abstractNum w:abstractNumId="10" w15:restartNumberingAfterBreak="0">
     <w:nsid w:val="27D97424"/>
     <w:multiLevelType w:val="hybridMultilevel"/>
     <w:tmpl w:val="DA42B4DC"/>
@@ -14835,7 +15769,7 @@
       </w:rPr>
     </w:lvl>
   </w:abstractNum>
-  <w:abstractNum w:abstractNumId="10" w15:restartNumberingAfterBreak="0">
+  <w:abstractNum w:abstractNumId="11" w15:restartNumberingAfterBreak="0">
     <w:nsid w:val="31747AB1"/>
     <w:multiLevelType w:val="multilevel"/>
     <w:tmpl w:val="0D2839AA"/>
@@ -14956,7 +15890,7 @@
       </w:rPr>
     </w:lvl>
   </w:abstractNum>
-  <w:abstractNum w:abstractNumId="11" w15:restartNumberingAfterBreak="0">
+  <w:abstractNum w:abstractNumId="12" w15:restartNumberingAfterBreak="0">
     <w:nsid w:val="345010AB"/>
     <w:multiLevelType w:val="hybridMultilevel"/>
     <w:tmpl w:val="47667F9E"/>
@@ -15069,7 +16003,156 @@
       </w:rPr>
     </w:lvl>
   </w:abstractNum>
-  <w:abstractNum w:abstractNumId="12" w15:restartNumberingAfterBreak="0">
+  <w:abstractNum w:abstractNumId="13" w15:restartNumberingAfterBreak="0">
+    <w:nsid w:val="35720DF5"/>
+    <w:multiLevelType w:val="multilevel"/>
+    <w:tmpl w:val="44BE8BB4"/>
+    <w:lvl w:ilvl="0">
+      <w:start w:val="1"/>
+      <w:numFmt w:val="bullet"/>
+      <w:lvlText w:val=""/>
+      <w:lvlJc w:val="left"/>
+      <w:pPr>
+        <w:tabs>
+          <w:tab w:val="num" w:pos="720"/>
+        </w:tabs>
+        <w:ind w:left="720" w:hanging="360"/>
+      </w:pPr>
+      <w:rPr>
+        <w:rFonts w:ascii="Symbol" w:hAnsi="Symbol" w:hint="default"/>
+        <w:sz w:val="20"/>
+      </w:rPr>
+    </w:lvl>
+    <w:lvl w:ilvl="1" w:tentative="1">
+      <w:start w:val="1"/>
+      <w:numFmt w:val="bullet"/>
+      <w:lvlText w:val="o"/>
+      <w:lvlJc w:val="left"/>
+      <w:pPr>
+        <w:tabs>
+          <w:tab w:val="num" w:pos="1440"/>
+        </w:tabs>
+        <w:ind w:left="1440" w:hanging="360"/>
+      </w:pPr>
+      <w:rPr>
+        <w:rFonts w:ascii="Courier New" w:hAnsi="Courier New" w:hint="default"/>
+        <w:sz w:val="20"/>
+      </w:rPr>
+    </w:lvl>
+    <w:lvl w:ilvl="2" w:tentative="1">
+      <w:start w:val="1"/>
+      <w:numFmt w:val="bullet"/>
+      <w:lvlText w:val=""/>
+      <w:lvlJc w:val="left"/>
+      <w:pPr>
+        <w:tabs>
+          <w:tab w:val="num" w:pos="2160"/>
+        </w:tabs>
+        <w:ind w:left="2160" w:hanging="360"/>
+      </w:pPr>
+      <w:rPr>
+        <w:rFonts w:ascii="Wingdings" w:hAnsi="Wingdings" w:hint="default"/>
+        <w:sz w:val="20"/>
+      </w:rPr>
+    </w:lvl>
+    <w:lvl w:ilvl="3" w:tentative="1">
+      <w:start w:val="1"/>
+      <w:numFmt w:val="bullet"/>
+      <w:lvlText w:val=""/>
+      <w:lvlJc w:val="left"/>
+      <w:pPr>
+        <w:tabs>
+          <w:tab w:val="num" w:pos="2880"/>
+        </w:tabs>
+        <w:ind w:left="2880" w:hanging="360"/>
+      </w:pPr>
+      <w:rPr>
+        <w:rFonts w:ascii="Wingdings" w:hAnsi="Wingdings" w:hint="default"/>
+        <w:sz w:val="20"/>
+      </w:rPr>
+    </w:lvl>
+    <w:lvl w:ilvl="4" w:tentative="1">
+      <w:start w:val="1"/>
+      <w:numFmt w:val="bullet"/>
+      <w:lvlText w:val=""/>
+      <w:lvlJc w:val="left"/>
+      <w:pPr>
+        <w:tabs>
+          <w:tab w:val="num" w:pos="3600"/>
+        </w:tabs>
+        <w:ind w:left="3600" w:hanging="360"/>
+      </w:pPr>
+      <w:rPr>
+        <w:rFonts w:ascii="Wingdings" w:hAnsi="Wingdings" w:hint="default"/>
+        <w:sz w:val="20"/>
+      </w:rPr>
+    </w:lvl>
+    <w:lvl w:ilvl="5" w:tentative="1">
+      <w:start w:val="1"/>
+      <w:numFmt w:val="bullet"/>
+      <w:lvlText w:val=""/>
+      <w:lvlJc w:val="left"/>
+      <w:pPr>
+        <w:tabs>
+          <w:tab w:val="num" w:pos="4320"/>
+        </w:tabs>
+        <w:ind w:left="4320" w:hanging="360"/>
+      </w:pPr>
+      <w:rPr>
+        <w:rFonts w:ascii="Wingdings" w:hAnsi="Wingdings" w:hint="default"/>
+        <w:sz w:val="20"/>
+      </w:rPr>
+    </w:lvl>
+    <w:lvl w:ilvl="6" w:tentative="1">
+      <w:start w:val="1"/>
+      <w:numFmt w:val="bullet"/>
+      <w:lvlText w:val=""/>
+      <w:lvlJc w:val="left"/>
+      <w:pPr>
+        <w:tabs>
+          <w:tab w:val="num" w:pos="5040"/>
+        </w:tabs>
+        <w:ind w:left="5040" w:hanging="360"/>
+      </w:pPr>
+      <w:rPr>
+        <w:rFonts w:ascii="Wingdings" w:hAnsi="Wingdings" w:hint="default"/>
+        <w:sz w:val="20"/>
+      </w:rPr>
+    </w:lvl>
+    <w:lvl w:ilvl="7" w:tentative="1">
+      <w:start w:val="1"/>
+      <w:numFmt w:val="bullet"/>
+      <w:lvlText w:val=""/>
+      <w:lvlJc w:val="left"/>
+      <w:pPr>
+        <w:tabs>
+          <w:tab w:val="num" w:pos="5760"/>
+        </w:tabs>
+        <w:ind w:left="5760" w:hanging="360"/>
+      </w:pPr>
+      <w:rPr>
+        <w:rFonts w:ascii="Wingdings" w:hAnsi="Wingdings" w:hint="default"/>
+        <w:sz w:val="20"/>
+      </w:rPr>
+    </w:lvl>
+    <w:lvl w:ilvl="8" w:tentative="1">
+      <w:start w:val="1"/>
+      <w:numFmt w:val="bullet"/>
+      <w:lvlText w:val=""/>
+      <w:lvlJc w:val="left"/>
+      <w:pPr>
+        <w:tabs>
+          <w:tab w:val="num" w:pos="6480"/>
+        </w:tabs>
+        <w:ind w:left="6480" w:hanging="360"/>
+      </w:pPr>
+      <w:rPr>
+        <w:rFonts w:ascii="Wingdings" w:hAnsi="Wingdings" w:hint="default"/>
+        <w:sz w:val="20"/>
+      </w:rPr>
+    </w:lvl>
+  </w:abstractNum>
+  <w:abstractNum w:abstractNumId="14" w15:restartNumberingAfterBreak="0">
     <w:nsid w:val="383A556B"/>
     <w:multiLevelType w:val="hybridMultilevel"/>
     <w:tmpl w:val="56825526"/>
@@ -15182,7 +16265,7 @@
       </w:rPr>
     </w:lvl>
   </w:abstractNum>
-  <w:abstractNum w:abstractNumId="13" w15:restartNumberingAfterBreak="0">
+  <w:abstractNum w:abstractNumId="15" w15:restartNumberingAfterBreak="0">
     <w:nsid w:val="390E0BA1"/>
     <w:multiLevelType w:val="hybridMultilevel"/>
     <w:tmpl w:val="B57E126C"/>
@@ -15295,7 +16378,7 @@
       </w:rPr>
     </w:lvl>
   </w:abstractNum>
-  <w:abstractNum w:abstractNumId="14" w15:restartNumberingAfterBreak="0">
+  <w:abstractNum w:abstractNumId="16" w15:restartNumberingAfterBreak="0">
     <w:nsid w:val="3B0D121D"/>
     <w:multiLevelType w:val="hybridMultilevel"/>
     <w:tmpl w:val="4EA818D4"/>
@@ -15408,7 +16491,7 @@
       </w:rPr>
     </w:lvl>
   </w:abstractNum>
-  <w:abstractNum w:abstractNumId="15" w15:restartNumberingAfterBreak="0">
+  <w:abstractNum w:abstractNumId="17" w15:restartNumberingAfterBreak="0">
     <w:nsid w:val="3EF75090"/>
     <w:multiLevelType w:val="hybridMultilevel"/>
     <w:tmpl w:val="E01665D2"/>
@@ -15521,7 +16604,7 @@
       </w:rPr>
     </w:lvl>
   </w:abstractNum>
-  <w:abstractNum w:abstractNumId="16" w15:restartNumberingAfterBreak="0">
+  <w:abstractNum w:abstractNumId="18" w15:restartNumberingAfterBreak="0">
     <w:nsid w:val="40BF237A"/>
     <w:multiLevelType w:val="hybridMultilevel"/>
     <w:tmpl w:val="78E6A74C"/>
@@ -15634,7 +16717,7 @@
       </w:rPr>
     </w:lvl>
   </w:abstractNum>
-  <w:abstractNum w:abstractNumId="17" w15:restartNumberingAfterBreak="0">
+  <w:abstractNum w:abstractNumId="19" w15:restartNumberingAfterBreak="0">
     <w:nsid w:val="4140023B"/>
     <w:multiLevelType w:val="hybridMultilevel"/>
     <w:tmpl w:val="A09AE4BE"/>
@@ -15747,7 +16830,7 @@
       </w:rPr>
     </w:lvl>
   </w:abstractNum>
-  <w:abstractNum w:abstractNumId="18" w15:restartNumberingAfterBreak="0">
+  <w:abstractNum w:abstractNumId="20" w15:restartNumberingAfterBreak="0">
     <w:nsid w:val="46945073"/>
     <w:multiLevelType w:val="multilevel"/>
     <w:tmpl w:val="2BBAEF62"/>
@@ -15896,7 +16979,7 @@
       </w:rPr>
     </w:lvl>
   </w:abstractNum>
-  <w:abstractNum w:abstractNumId="19" w15:restartNumberingAfterBreak="0">
+  <w:abstractNum w:abstractNumId="21" w15:restartNumberingAfterBreak="0">
     <w:nsid w:val="46E04835"/>
     <w:multiLevelType w:val="hybridMultilevel"/>
     <w:tmpl w:val="9F807178"/>
@@ -16036,7 +17119,7 @@
       </w:rPr>
     </w:lvl>
   </w:abstractNum>
-  <w:abstractNum w:abstractNumId="20" w15:restartNumberingAfterBreak="0">
+  <w:abstractNum w:abstractNumId="22" w15:restartNumberingAfterBreak="0">
     <w:nsid w:val="47D0469F"/>
     <w:multiLevelType w:val="hybridMultilevel"/>
     <w:tmpl w:val="1646FFF2"/>
@@ -16149,7 +17232,7 @@
       </w:rPr>
     </w:lvl>
   </w:abstractNum>
-  <w:abstractNum w:abstractNumId="21" w15:restartNumberingAfterBreak="0">
+  <w:abstractNum w:abstractNumId="23" w15:restartNumberingAfterBreak="0">
     <w:nsid w:val="47F9505E"/>
     <w:multiLevelType w:val="hybridMultilevel"/>
     <w:tmpl w:val="C3EEF4E8"/>
@@ -16262,7 +17345,7 @@
       </w:rPr>
     </w:lvl>
   </w:abstractNum>
-  <w:abstractNum w:abstractNumId="22" w15:restartNumberingAfterBreak="0">
+  <w:abstractNum w:abstractNumId="24" w15:restartNumberingAfterBreak="0">
     <w:nsid w:val="4CFC330A"/>
     <w:multiLevelType w:val="hybridMultilevel"/>
     <w:tmpl w:val="A07E96BC"/>
@@ -16402,7 +17485,7 @@
       </w:rPr>
     </w:lvl>
   </w:abstractNum>
-  <w:abstractNum w:abstractNumId="23" w15:restartNumberingAfterBreak="0">
+  <w:abstractNum w:abstractNumId="25" w15:restartNumberingAfterBreak="0">
     <w:nsid w:val="4F05287A"/>
     <w:multiLevelType w:val="multilevel"/>
     <w:tmpl w:val="27BE0522"/>
@@ -16551,7 +17634,7 @@
       </w:rPr>
     </w:lvl>
   </w:abstractNum>
-  <w:abstractNum w:abstractNumId="24" w15:restartNumberingAfterBreak="0">
+  <w:abstractNum w:abstractNumId="26" w15:restartNumberingAfterBreak="0">
     <w:nsid w:val="51D2372B"/>
     <w:multiLevelType w:val="multilevel"/>
     <w:tmpl w:val="5E927778"/>
@@ -16700,7 +17783,7 @@
       </w:rPr>
     </w:lvl>
   </w:abstractNum>
-  <w:abstractNum w:abstractNumId="25" w15:restartNumberingAfterBreak="0">
+  <w:abstractNum w:abstractNumId="27" w15:restartNumberingAfterBreak="0">
     <w:nsid w:val="51F9049B"/>
     <w:multiLevelType w:val="hybridMultilevel"/>
     <w:tmpl w:val="B0D46B90"/>
@@ -16813,7 +17896,7 @@
       </w:rPr>
     </w:lvl>
   </w:abstractNum>
-  <w:abstractNum w:abstractNumId="26" w15:restartNumberingAfterBreak="0">
+  <w:abstractNum w:abstractNumId="28" w15:restartNumberingAfterBreak="0">
     <w:nsid w:val="536F20AB"/>
     <w:multiLevelType w:val="hybridMultilevel"/>
     <w:tmpl w:val="F7A416EA"/>
@@ -16926,7 +18009,7 @@
       </w:rPr>
     </w:lvl>
   </w:abstractNum>
-  <w:abstractNum w:abstractNumId="27" w15:restartNumberingAfterBreak="0">
+  <w:abstractNum w:abstractNumId="29" w15:restartNumberingAfterBreak="0">
     <w:nsid w:val="54212D15"/>
     <w:multiLevelType w:val="multilevel"/>
     <w:tmpl w:val="FA26210E"/>
@@ -17045,7 +18128,7 @@
       </w:rPr>
     </w:lvl>
   </w:abstractNum>
-  <w:abstractNum w:abstractNumId="28" w15:restartNumberingAfterBreak="0">
+  <w:abstractNum w:abstractNumId="30" w15:restartNumberingAfterBreak="0">
     <w:nsid w:val="54B14D6F"/>
     <w:multiLevelType w:val="multilevel"/>
     <w:tmpl w:val="D938EFF4"/>
@@ -17194,7 +18277,7 @@
       </w:rPr>
     </w:lvl>
   </w:abstractNum>
-  <w:abstractNum w:abstractNumId="29" w15:restartNumberingAfterBreak="0">
+  <w:abstractNum w:abstractNumId="31" w15:restartNumberingAfterBreak="0">
     <w:nsid w:val="57730FB1"/>
     <w:multiLevelType w:val="hybridMultilevel"/>
     <w:tmpl w:val="52A02ED2"/>
@@ -17307,7 +18390,7 @@
       </w:rPr>
     </w:lvl>
   </w:abstractNum>
-  <w:abstractNum w:abstractNumId="30" w15:restartNumberingAfterBreak="0">
+  <w:abstractNum w:abstractNumId="32" w15:restartNumberingAfterBreak="0">
     <w:nsid w:val="59670EF0"/>
     <w:multiLevelType w:val="hybridMultilevel"/>
     <w:tmpl w:val="69C2D6FA"/>
@@ -17420,7 +18503,7 @@
       </w:rPr>
     </w:lvl>
   </w:abstractNum>
-  <w:abstractNum w:abstractNumId="31" w15:restartNumberingAfterBreak="0">
+  <w:abstractNum w:abstractNumId="33" w15:restartNumberingAfterBreak="0">
     <w:nsid w:val="5EB03E3F"/>
     <w:multiLevelType w:val="hybridMultilevel"/>
     <w:tmpl w:val="7CE49F36"/>
@@ -17560,7 +18643,7 @@
       </w:rPr>
     </w:lvl>
   </w:abstractNum>
-  <w:abstractNum w:abstractNumId="32" w15:restartNumberingAfterBreak="0">
+  <w:abstractNum w:abstractNumId="34" w15:restartNumberingAfterBreak="0">
     <w:nsid w:val="5F034D31"/>
     <w:multiLevelType w:val="multilevel"/>
     <w:tmpl w:val="D938EFF4"/>
@@ -17709,7 +18792,7 @@
       </w:rPr>
     </w:lvl>
   </w:abstractNum>
-  <w:abstractNum w:abstractNumId="33" w15:restartNumberingAfterBreak="0">
+  <w:abstractNum w:abstractNumId="35" w15:restartNumberingAfterBreak="0">
     <w:nsid w:val="5FA92F6E"/>
     <w:multiLevelType w:val="hybridMultilevel"/>
     <w:tmpl w:val="BB36A234"/>
@@ -17822,7 +18905,7 @@
       </w:rPr>
     </w:lvl>
   </w:abstractNum>
-  <w:abstractNum w:abstractNumId="34" w15:restartNumberingAfterBreak="0">
+  <w:abstractNum w:abstractNumId="36" w15:restartNumberingAfterBreak="0">
     <w:nsid w:val="629249C0"/>
     <w:multiLevelType w:val="hybridMultilevel"/>
     <w:tmpl w:val="F854402E"/>
@@ -17935,7 +19018,7 @@
       </w:rPr>
     </w:lvl>
   </w:abstractNum>
-  <w:abstractNum w:abstractNumId="35" w15:restartNumberingAfterBreak="0">
+  <w:abstractNum w:abstractNumId="37" w15:restartNumberingAfterBreak="0">
     <w:nsid w:val="635217CB"/>
     <w:multiLevelType w:val="multilevel"/>
     <w:tmpl w:val="D938EFF4"/>
@@ -18084,7 +19167,7 @@
       </w:rPr>
     </w:lvl>
   </w:abstractNum>
-  <w:abstractNum w:abstractNumId="36" w15:restartNumberingAfterBreak="0">
+  <w:abstractNum w:abstractNumId="38" w15:restartNumberingAfterBreak="0">
     <w:nsid w:val="65B35D78"/>
     <w:multiLevelType w:val="hybridMultilevel"/>
     <w:tmpl w:val="090EB91A"/>
@@ -18197,7 +19280,7 @@
       </w:rPr>
     </w:lvl>
   </w:abstractNum>
-  <w:abstractNum w:abstractNumId="37" w15:restartNumberingAfterBreak="0">
+  <w:abstractNum w:abstractNumId="39" w15:restartNumberingAfterBreak="0">
     <w:nsid w:val="66AC17DD"/>
     <w:multiLevelType w:val="hybridMultilevel"/>
     <w:tmpl w:val="6C742D6A"/>
@@ -18310,7 +19393,7 @@
       </w:rPr>
     </w:lvl>
   </w:abstractNum>
-  <w:abstractNum w:abstractNumId="38" w15:restartNumberingAfterBreak="0">
+  <w:abstractNum w:abstractNumId="40" w15:restartNumberingAfterBreak="0">
     <w:nsid w:val="674B0406"/>
     <w:multiLevelType w:val="hybridMultilevel"/>
     <w:tmpl w:val="32F2D32E"/>
@@ -18450,7 +19533,7 @@
       </w:rPr>
     </w:lvl>
   </w:abstractNum>
-  <w:abstractNum w:abstractNumId="39" w15:restartNumberingAfterBreak="0">
+  <w:abstractNum w:abstractNumId="41" w15:restartNumberingAfterBreak="0">
     <w:nsid w:val="67903BD8"/>
     <w:multiLevelType w:val="hybridMultilevel"/>
     <w:tmpl w:val="342E5540"/>
@@ -18563,7 +19646,7 @@
       </w:rPr>
     </w:lvl>
   </w:abstractNum>
-  <w:abstractNum w:abstractNumId="40" w15:restartNumberingAfterBreak="0">
+  <w:abstractNum w:abstractNumId="42" w15:restartNumberingAfterBreak="0">
     <w:nsid w:val="6A2131E2"/>
     <w:multiLevelType w:val="hybridMultilevel"/>
     <w:tmpl w:val="D772E690"/>
@@ -18703,7 +19786,7 @@
       </w:rPr>
     </w:lvl>
   </w:abstractNum>
-  <w:abstractNum w:abstractNumId="41" w15:restartNumberingAfterBreak="0">
+  <w:abstractNum w:abstractNumId="43" w15:restartNumberingAfterBreak="0">
     <w:nsid w:val="6B851B01"/>
     <w:multiLevelType w:val="multilevel"/>
     <w:tmpl w:val="D938EFF4"/>
@@ -18852,7 +19935,7 @@
       </w:rPr>
     </w:lvl>
   </w:abstractNum>
-  <w:abstractNum w:abstractNumId="42" w15:restartNumberingAfterBreak="0">
+  <w:abstractNum w:abstractNumId="44" w15:restartNumberingAfterBreak="0">
     <w:nsid w:val="7173173D"/>
     <w:multiLevelType w:val="hybridMultilevel"/>
     <w:tmpl w:val="48DCB25C"/>
@@ -18965,7 +20048,7 @@
       </w:rPr>
     </w:lvl>
   </w:abstractNum>
-  <w:abstractNum w:abstractNumId="43" w15:restartNumberingAfterBreak="0">
+  <w:abstractNum w:abstractNumId="45" w15:restartNumberingAfterBreak="0">
     <w:nsid w:val="7D2F59D8"/>
     <w:multiLevelType w:val="hybridMultilevel"/>
     <w:tmpl w:val="B65ECEBE"/>
@@ -19078,7 +20161,7 @@
       </w:rPr>
     </w:lvl>
   </w:abstractNum>
-  <w:abstractNum w:abstractNumId="44" w15:restartNumberingAfterBreak="0">
+  <w:abstractNum w:abstractNumId="46" w15:restartNumberingAfterBreak="0">
     <w:nsid w:val="7E125A84"/>
     <w:multiLevelType w:val="multilevel"/>
     <w:tmpl w:val="D938EFF4"/>
@@ -19227,7 +20310,7 @@
       </w:rPr>
     </w:lvl>
   </w:abstractNum>
-  <w:abstractNum w:abstractNumId="45" w15:restartNumberingAfterBreak="0">
+  <w:abstractNum w:abstractNumId="47" w15:restartNumberingAfterBreak="0">
     <w:nsid w:val="7F0A6D5A"/>
     <w:multiLevelType w:val="hybridMultilevel"/>
     <w:tmpl w:val="E9BEBBE2"/>
@@ -19340,7 +20423,7 @@
       </w:rPr>
     </w:lvl>
   </w:abstractNum>
-  <w:abstractNum w:abstractNumId="46" w15:restartNumberingAfterBreak="0">
+  <w:abstractNum w:abstractNumId="48" w15:restartNumberingAfterBreak="0">
     <w:nsid w:val="7FA816BA"/>
     <w:multiLevelType w:val="hybridMultilevel"/>
     <w:tmpl w:val="1138D888"/>
@@ -19454,10 +20537,10 @@
     </w:lvl>
   </w:abstractNum>
   <w:num w:numId="1" w16cid:durableId="189228340">
-    <w:abstractNumId w:val="27"/>
+    <w:abstractNumId w:val="29"/>
   </w:num>
   <w:num w:numId="2" w16cid:durableId="2121757450">
-    <w:abstractNumId w:val="27"/>
+    <w:abstractNumId w:val="29"/>
     <w:lvlOverride w:ilvl="0">
       <w:startOverride w:val="1"/>
     </w:lvlOverride>
@@ -19487,37 +20570,37 @@
     </w:lvlOverride>
   </w:num>
   <w:num w:numId="3" w16cid:durableId="1069301154">
-    <w:abstractNumId w:val="10"/>
+    <w:abstractNumId w:val="11"/>
   </w:num>
   <w:num w:numId="4" w16cid:durableId="267811051">
     <w:abstractNumId w:val="6"/>
   </w:num>
   <w:num w:numId="5" w16cid:durableId="318463391">
-    <w:abstractNumId w:val="37"/>
+    <w:abstractNumId w:val="39"/>
   </w:num>
   <w:num w:numId="6" w16cid:durableId="699548813">
     <w:abstractNumId w:val="4"/>
   </w:num>
   <w:num w:numId="7" w16cid:durableId="54084183">
-    <w:abstractNumId w:val="35"/>
+    <w:abstractNumId w:val="37"/>
   </w:num>
   <w:num w:numId="8" w16cid:durableId="956569811">
-    <w:abstractNumId w:val="44"/>
+    <w:abstractNumId w:val="46"/>
   </w:num>
   <w:num w:numId="9" w16cid:durableId="776170593">
-    <w:abstractNumId w:val="41"/>
+    <w:abstractNumId w:val="43"/>
   </w:num>
   <w:num w:numId="10" w16cid:durableId="1321815179">
-    <w:abstractNumId w:val="28"/>
+    <w:abstractNumId w:val="30"/>
   </w:num>
   <w:num w:numId="11" w16cid:durableId="523133568">
-    <w:abstractNumId w:val="32"/>
+    <w:abstractNumId w:val="34"/>
   </w:num>
   <w:num w:numId="12" w16cid:durableId="253320150">
-    <w:abstractNumId w:val="34"/>
+    <w:abstractNumId w:val="36"/>
   </w:num>
   <w:num w:numId="13" w16cid:durableId="239601409">
-    <w:abstractNumId w:val="33"/>
+    <w:abstractNumId w:val="35"/>
   </w:num>
   <w:num w:numId="14" w16cid:durableId="1222058412">
     <w:abstractNumId w:val="1"/>
@@ -19526,55 +20609,55 @@
     <w:abstractNumId w:val="5"/>
   </w:num>
   <w:num w:numId="16" w16cid:durableId="1644658117">
-    <w:abstractNumId w:val="25"/>
+    <w:abstractNumId w:val="27"/>
   </w:num>
   <w:num w:numId="17" w16cid:durableId="653139887">
-    <w:abstractNumId w:val="15"/>
+    <w:abstractNumId w:val="17"/>
   </w:num>
   <w:num w:numId="18" w16cid:durableId="846213151">
-    <w:abstractNumId w:val="26"/>
+    <w:abstractNumId w:val="28"/>
   </w:num>
   <w:num w:numId="19" w16cid:durableId="1132869341">
     <w:abstractNumId w:val="2"/>
   </w:num>
   <w:num w:numId="20" w16cid:durableId="1995723185">
-    <w:abstractNumId w:val="14"/>
+    <w:abstractNumId w:val="16"/>
   </w:num>
   <w:num w:numId="21" w16cid:durableId="1838693387">
-    <w:abstractNumId w:val="22"/>
+    <w:abstractNumId w:val="24"/>
   </w:num>
   <w:num w:numId="22" w16cid:durableId="107089443">
     <w:abstractNumId w:val="7"/>
   </w:num>
   <w:num w:numId="23" w16cid:durableId="355544500">
+    <w:abstractNumId w:val="21"/>
+  </w:num>
+  <w:num w:numId="24" w16cid:durableId="1858810707">
     <w:abstractNumId w:val="19"/>
   </w:num>
-  <w:num w:numId="24" w16cid:durableId="1858810707">
-    <w:abstractNumId w:val="17"/>
+  <w:num w:numId="25" w16cid:durableId="601912822">
+    <w:abstractNumId w:val="10"/>
   </w:num>
-  <w:num w:numId="25" w16cid:durableId="601912822">
+  <w:num w:numId="26" w16cid:durableId="2024626875">
+    <w:abstractNumId w:val="48"/>
+  </w:num>
+  <w:num w:numId="27" w16cid:durableId="946081625">
+    <w:abstractNumId w:val="47"/>
+  </w:num>
+  <w:num w:numId="28" w16cid:durableId="1707679728">
+    <w:abstractNumId w:val="38"/>
+  </w:num>
+  <w:num w:numId="29" w16cid:durableId="1825200378">
+    <w:abstractNumId w:val="40"/>
+  </w:num>
+  <w:num w:numId="30" w16cid:durableId="1324628546">
     <w:abstractNumId w:val="9"/>
   </w:num>
-  <w:num w:numId="26" w16cid:durableId="2024626875">
-    <w:abstractNumId w:val="46"/>
-  </w:num>
-  <w:num w:numId="27" w16cid:durableId="946081625">
-    <w:abstractNumId w:val="45"/>
-  </w:num>
-  <w:num w:numId="28" w16cid:durableId="1707679728">
-    <w:abstractNumId w:val="36"/>
-  </w:num>
-  <w:num w:numId="29" w16cid:durableId="1825200378">
-    <w:abstractNumId w:val="38"/>
-  </w:num>
-  <w:num w:numId="30" w16cid:durableId="1324628546">
-    <w:abstractNumId w:val="8"/>
-  </w:num>
   <w:num w:numId="31" w16cid:durableId="1131629395">
-    <w:abstractNumId w:val="31"/>
+    <w:abstractNumId w:val="33"/>
   </w:num>
   <w:num w:numId="32" w16cid:durableId="325866676">
-    <w:abstractNumId w:val="20"/>
+    <w:abstractNumId w:val="22"/>
   </w:num>
   <w:num w:numId="33" w16cid:durableId="216478831">
     <w:abstractNumId w:val="0"/>
@@ -19583,46 +20666,52 @@
     <w:abstractNumId w:val="3"/>
   </w:num>
   <w:num w:numId="35" w16cid:durableId="390076088">
-    <w:abstractNumId w:val="29"/>
+    <w:abstractNumId w:val="31"/>
   </w:num>
   <w:num w:numId="36" w16cid:durableId="905843952">
+    <w:abstractNumId w:val="44"/>
+  </w:num>
+  <w:num w:numId="37" w16cid:durableId="711609997">
+    <w:abstractNumId w:val="14"/>
+  </w:num>
+  <w:num w:numId="38" w16cid:durableId="2070107708">
+    <w:abstractNumId w:val="45"/>
+  </w:num>
+  <w:num w:numId="39" w16cid:durableId="993870229">
     <w:abstractNumId w:val="42"/>
   </w:num>
-  <w:num w:numId="37" w16cid:durableId="711609997">
+  <w:num w:numId="40" w16cid:durableId="1302538477">
+    <w:abstractNumId w:val="26"/>
+  </w:num>
+  <w:num w:numId="41" w16cid:durableId="339889238">
+    <w:abstractNumId w:val="20"/>
+  </w:num>
+  <w:num w:numId="42" w16cid:durableId="521893377">
+    <w:abstractNumId w:val="25"/>
+  </w:num>
+  <w:num w:numId="43" w16cid:durableId="346249253">
+    <w:abstractNumId w:val="18"/>
+  </w:num>
+  <w:num w:numId="44" w16cid:durableId="1055012332">
+    <w:abstractNumId w:val="41"/>
+  </w:num>
+  <w:num w:numId="45" w16cid:durableId="2083600008">
+    <w:abstractNumId w:val="15"/>
+  </w:num>
+  <w:num w:numId="46" w16cid:durableId="1228145899">
+    <w:abstractNumId w:val="23"/>
+  </w:num>
+  <w:num w:numId="47" w16cid:durableId="1513640639">
     <w:abstractNumId w:val="12"/>
   </w:num>
-  <w:num w:numId="38" w16cid:durableId="2070107708">
-    <w:abstractNumId w:val="43"/>
+  <w:num w:numId="48" w16cid:durableId="406080131">
+    <w:abstractNumId w:val="32"/>
   </w:num>
-  <w:num w:numId="39" w16cid:durableId="993870229">
-    <w:abstractNumId w:val="40"/>
-  </w:num>
-  <w:num w:numId="40" w16cid:durableId="1302538477">
-    <w:abstractNumId w:val="24"/>
-  </w:num>
-  <w:num w:numId="41" w16cid:durableId="339889238">
-    <w:abstractNumId w:val="18"/>
-  </w:num>
-  <w:num w:numId="42" w16cid:durableId="521893377">
-    <w:abstractNumId w:val="23"/>
-  </w:num>
-  <w:num w:numId="43" w16cid:durableId="346249253">
-    <w:abstractNumId w:val="16"/>
-  </w:num>
-  <w:num w:numId="44" w16cid:durableId="1055012332">
-    <w:abstractNumId w:val="39"/>
-  </w:num>
-  <w:num w:numId="45" w16cid:durableId="2083600008">
+  <w:num w:numId="49" w16cid:durableId="1936016408">
     <w:abstractNumId w:val="13"/>
   </w:num>
-  <w:num w:numId="46" w16cid:durableId="1228145899">
-    <w:abstractNumId w:val="21"/>
-  </w:num>
-  <w:num w:numId="47" w16cid:durableId="1513640639">
-    <w:abstractNumId w:val="11"/>
-  </w:num>
-  <w:num w:numId="48" w16cid:durableId="406080131">
-    <w:abstractNumId w:val="30"/>
+  <w:num w:numId="50" w16cid:durableId="696810047">
+    <w:abstractNumId w:val="8"/>
   </w:num>
 </w:numbering>
 </file>
@@ -20247,6 +21336,7 @@
   <w:style w:type="character" w:default="1" w:styleId="DefaultParagraphFont">
     <w:name w:val="Default Paragraph Font"/>
     <w:uiPriority w:val="1"/>
+    <w:semiHidden/>
     <w:unhideWhenUsed/>
   </w:style>
   <w:style w:type="table" w:default="1" w:styleId="TableNormal">

</xml_diff>

<commit_message>
sửa ppxt vs word phần CA
</commit_message>
<xml_diff>
--- a/LeDuyTuanAnh_NguyenTuanAnh_LyLamVu.docx
+++ b/LeDuyTuanAnh_NguyenTuanAnh_LyLamVu.docx
@@ -1481,7 +1481,6 @@
                 <w:szCs w:val="22"/>
               </w:rPr>
             </w:pPr>
-            <w:proofErr w:type="gramStart"/>
             <w:r>
               <w:rPr>
                 <w:rFonts w:cstheme="minorHAnsi"/>
@@ -1491,33 +1490,8 @@
                 <w:sz w:val="24"/>
                 <w:szCs w:val="22"/>
               </w:rPr>
-              <w:t>( Ký</w:t>
-            </w:r>
-            <w:proofErr w:type="gramEnd"/>
-            <w:r>
-              <w:rPr>
-                <w:rFonts w:cstheme="minorHAnsi"/>
-                <w:i/>
-                <w:iCs/>
-                <w:color w:val="000000" w:themeColor="text1"/>
-                <w:sz w:val="24"/>
-                <w:szCs w:val="22"/>
-              </w:rPr>
-              <w:t xml:space="preserve"> và ghi rõ họ </w:t>
-            </w:r>
-            <w:proofErr w:type="gramStart"/>
-            <w:r>
-              <w:rPr>
-                <w:rFonts w:cstheme="minorHAnsi"/>
-                <w:i/>
-                <w:iCs/>
-                <w:color w:val="000000" w:themeColor="text1"/>
-                <w:sz w:val="24"/>
-                <w:szCs w:val="22"/>
-              </w:rPr>
-              <w:t>tên )</w:t>
-            </w:r>
-            <w:proofErr w:type="gramEnd"/>
+              <w:t>( Ký và ghi rõ họ tên )</w:t>
+            </w:r>
           </w:p>
           <w:p/>
         </w:tc>
@@ -6260,21 +6234,13 @@
         <w:tab/>
       </w:r>
       <w:r>
-        <w:t xml:space="preserve">Trong bối cảnh thương mại điện tử phát triển mạnh mẽ, các nền tảng như Shopee đã trở thành kênh phân phối quan trọng đối với các sản phẩm điện thoại di động. Đây là mặt hàng có nhu cầu cao nhưng cũng đi kèm với mức độ cạnh tranh </w:t>
-      </w:r>
-      <w:proofErr w:type="gramStart"/>
-      <w:r>
-        <w:t>lớn</w:t>
+        <w:t>Trong bối cảnh thương mại điện tử phát triển mạnh mẽ, các nền tảng như Shopee đã trở thành kênh phân phối quan trọng đối với các sản phẩm điện thoại di động. Đây là mặt hàng có nhu cầu cao nhưng cũng đi kèm với mức độ cạnh tranh lớn</w:t>
       </w:r>
       <w:r>
         <w:t xml:space="preserve">, </w:t>
       </w:r>
       <w:r>
-        <w:t xml:space="preserve"> thực</w:t>
-      </w:r>
-      <w:proofErr w:type="gramEnd"/>
-      <w:r>
-        <w:t xml:space="preserve"> tế cho thấy không phải tất cả sản phẩm đều đạt hiệu quả kinh doanh. Một số có doanh số thấp do chưa phù hợp với nhu cầu thị trường, mức giá chưa tối ưu hoặc chưa được tiếp cận đúng tệp khách hàng mục tiêu. </w:t>
+        <w:t xml:space="preserve"> thực tế cho thấy không phải tất cả sản phẩm đều đạt hiệu quả kinh doanh. Một số có doanh số thấp do chưa phù hợp với nhu cầu thị trường, mức giá chưa tối ưu hoặc chưa được tiếp cận đúng tệp khách hàng mục tiêu. </w:t>
       </w:r>
       <w:r>
         <w:t>Có</w:t>
@@ -6371,23 +6337,7 @@
         <w:jc w:val="both"/>
       </w:pPr>
       <w:r>
-        <w:t xml:space="preserve">Bán cái gì? (Nên đầu tư chạy Ads cho </w:t>
-      </w:r>
-      <w:proofErr w:type="gramStart"/>
-      <w:r>
-        <w:t>mặt  hàng</w:t>
-      </w:r>
-      <w:proofErr w:type="gramEnd"/>
-      <w:r>
-        <w:t xml:space="preserve"> nào, phân khúc nào đang dễ chốt đơn </w:t>
-      </w:r>
-      <w:proofErr w:type="gramStart"/>
-      <w:r>
-        <w:t>nhất,..</w:t>
-      </w:r>
-      <w:proofErr w:type="gramEnd"/>
-      <w:r>
-        <w:t>)</w:t>
+        <w:t>Bán cái gì? (Nên đầu tư chạy Ads cho mặt  hàng nào, phân khúc nào đang dễ chốt đơn nhất,..)</w:t>
       </w:r>
     </w:p>
     <w:p>
@@ -6400,23 +6350,7 @@
         <w:jc w:val="both"/>
       </w:pPr>
       <w:r>
-        <w:t xml:space="preserve">Bán cho ai, ở </w:t>
-      </w:r>
-      <w:proofErr w:type="gramStart"/>
-      <w:r>
-        <w:t>đâu ?</w:t>
-      </w:r>
-      <w:proofErr w:type="gramEnd"/>
-      <w:r>
-        <w:t xml:space="preserve"> </w:t>
-      </w:r>
-      <w:proofErr w:type="gramStart"/>
-      <w:r>
-        <w:t>( Hành</w:t>
-      </w:r>
-      <w:proofErr w:type="gramEnd"/>
-      <w:r>
-        <w:t xml:space="preserve"> vi mua sắm ở các khu vực có khác nhau không?)</w:t>
+        <w:t>Bán cho ai, ở đâu ? ( Hành vi mua sắm ở các khu vực có khác nhau không?)</w:t>
       </w:r>
     </w:p>
     <w:p>
@@ -6429,29 +6363,8 @@
         <w:jc w:val="both"/>
       </w:pPr>
       <w:r>
-        <w:t xml:space="preserve">Dùng chiến lược gì? </w:t>
-      </w:r>
-      <w:proofErr w:type="gramStart"/>
-      <w:r>
-        <w:t>( Giảm</w:t>
-      </w:r>
-      <w:proofErr w:type="gramEnd"/>
-      <w:r>
-        <w:t xml:space="preserve"> giá mạnh liệu có </w:t>
-      </w:r>
-      <w:proofErr w:type="gramStart"/>
-      <w:r>
-        <w:t>tăng  doanh</w:t>
-      </w:r>
-      <w:proofErr w:type="gramEnd"/>
-      <w:r>
-        <w:t xml:space="preserve"> thu, hay khách hàng quan tâm đến số rating hơn</w:t>
-      </w:r>
-      <w:proofErr w:type="gramStart"/>
-      <w:r>
-        <w:t>? )</w:t>
-      </w:r>
-      <w:proofErr w:type="gramEnd"/>
+        <w:t>Dùng chiến lược gì? ( Giảm giá mạnh liệu có tăng  doanh thu, hay khách hàng quan tâm đến số rating hơn? )</w:t>
+      </w:r>
     </w:p>
     <w:p>
       <w:pPr>
@@ -6505,15 +6418,7 @@
         </w:numPr>
       </w:pPr>
       <w:r>
-        <w:t xml:space="preserve">Hỗ trợ trực quan hóa bằng sơ đồ: Các thư viện Pyplot, </w:t>
-      </w:r>
-      <w:proofErr w:type="gramStart"/>
-      <w:r>
-        <w:t>Seaborn,…</w:t>
-      </w:r>
-      <w:proofErr w:type="gramEnd"/>
-      <w:r>
-        <w:t xml:space="preserve"> của Python</w:t>
+        <w:t>Hỗ trợ trực quan hóa bằng sơ đồ: Các thư viện Pyplot, Seaborn,… của Python</w:t>
       </w:r>
     </w:p>
     <w:p>
@@ -6947,21 +6852,7 @@
               <w:rPr>
                 <w:szCs w:val="28"/>
               </w:rPr>
-              <w:t xml:space="preserve">Khai thác và thẩm định tập dữ </w:t>
-            </w:r>
-            <w:proofErr w:type="gramStart"/>
-            <w:r>
-              <w:rPr>
-                <w:szCs w:val="28"/>
-              </w:rPr>
-              <w:t>liệu  từ</w:t>
-            </w:r>
-            <w:proofErr w:type="gramEnd"/>
-            <w:r>
-              <w:rPr>
-                <w:szCs w:val="28"/>
-              </w:rPr>
-              <w:t xml:space="preserve"> sàn thương mại điện tử trên nền tảng Kaggle</w:t>
+              <w:t>Khai thác và thẩm định tập dữ liệu  từ sàn thương mại điện tử trên nền tảng Kaggle</w:t>
             </w:r>
           </w:p>
         </w:tc>
@@ -7212,47 +7103,7 @@
                 <w:kern w:val="24"/>
                 <w:szCs w:val="28"/>
               </w:rPr>
-              <w:t xml:space="preserve">Tiến hành làm sạch </w:t>
-            </w:r>
-            <w:proofErr w:type="gramStart"/>
-            <w:r>
-              <w:rPr>
-                <w:rFonts w:eastAsia="Arimo Medium"/>
-                <w:color w:val="000000" w:themeColor="text1"/>
-                <w:kern w:val="24"/>
-                <w:szCs w:val="28"/>
-              </w:rPr>
-              <w:t>( loại</w:t>
-            </w:r>
-            <w:proofErr w:type="gramEnd"/>
-            <w:r>
-              <w:rPr>
-                <w:rFonts w:eastAsia="Arimo Medium"/>
-                <w:color w:val="000000" w:themeColor="text1"/>
-                <w:kern w:val="24"/>
-                <w:szCs w:val="28"/>
-              </w:rPr>
-              <w:t xml:space="preserve"> bỏ mặt hàng </w:t>
-            </w:r>
-            <w:proofErr w:type="gramStart"/>
-            <w:r>
-              <w:rPr>
-                <w:rFonts w:eastAsia="Arimo Medium"/>
-                <w:color w:val="000000" w:themeColor="text1"/>
-                <w:kern w:val="24"/>
-                <w:szCs w:val="28"/>
-              </w:rPr>
-              <w:t>thừa,…</w:t>
-            </w:r>
-            <w:proofErr w:type="gramEnd"/>
-            <w:r>
-              <w:rPr>
-                <w:rFonts w:eastAsia="Arimo Medium"/>
-                <w:color w:val="000000" w:themeColor="text1"/>
-                <w:kern w:val="24"/>
-                <w:szCs w:val="28"/>
-              </w:rPr>
-              <w:t>.)</w:t>
+              <w:t>Tiến hành làm sạch ( loại bỏ mặt hàng thừa,….)</w:t>
             </w:r>
             <w:r>
               <w:rPr>
@@ -8348,16 +8199,11 @@
       <w:r>
         <w:t>Địa chỉ Shop</w:t>
       </w:r>
-      <w:proofErr w:type="gramStart"/>
       <w:r>
         <w:t xml:space="preserve">), </w:t>
       </w:r>
       <w:r>
-        <w:t xml:space="preserve"> name</w:t>
-      </w:r>
-      <w:proofErr w:type="gramEnd"/>
-      <w:r>
-        <w:t xml:space="preserve"> </w:t>
+        <w:t xml:space="preserve"> name </w:t>
       </w:r>
       <w:r>
         <w:t>(</w:t>
@@ -8577,15 +8423,7 @@
         <w:jc w:val="both"/>
       </w:pPr>
       <w:r>
-        <w:t xml:space="preserve">Đây là phần sheet quan trọng trong dự án này, mô tả đầy đủ chi tiết về thông tin bán các sản phẩm điện thoại. Sheet này được sử dụng kết hợp cùng với sheet ID </w:t>
-      </w:r>
-      <w:proofErr w:type="gramStart"/>
-      <w:r>
-        <w:t>để  tiến</w:t>
-      </w:r>
-      <w:proofErr w:type="gramEnd"/>
-      <w:r>
-        <w:t xml:space="preserve"> hành nghiên cứu dữ liệu. </w:t>
+        <w:t xml:space="preserve">Đây là phần sheet quan trọng trong dự án này, mô tả đầy đủ chi tiết về thông tin bán các sản phẩm điện thoại. Sheet này được sử dụng kết hợp cùng với sheet ID để  tiến hành nghiên cứu dữ liệu. </w:t>
       </w:r>
     </w:p>
     <w:p>
@@ -9193,7 +9031,6 @@
       <w:r>
         <w:t xml:space="preserve">Tiến hành chọn lọc thông qua thuộc tính </w:t>
       </w:r>
-      <w:proofErr w:type="gramStart"/>
       <w:r>
         <w:rPr>
           <w:b/>
@@ -9202,19 +9039,7 @@
         <w:t xml:space="preserve">name  </w:t>
       </w:r>
       <w:r>
-        <w:t>bằng</w:t>
-      </w:r>
-      <w:proofErr w:type="gramEnd"/>
-      <w:r>
-        <w:t xml:space="preserve"> cách phân tích chuỗi, nếu như sản phẩm là điện thoại thì giá trị thuộc tính này phải ít nhất chứa chuỗi “điện thoại” hoặc “&lt;</w:t>
-      </w:r>
-      <w:proofErr w:type="gramStart"/>
-      <w:r>
-        <w:t>hãng :</w:t>
-      </w:r>
-      <w:proofErr w:type="gramEnd"/>
-      <w:r>
-        <w:t xml:space="preserve"> Oppo, Xiaomi &gt;”.</w:t>
+        <w:t>bằng cách phân tích chuỗi, nếu như sản phẩm là điện thoại thì giá trị thuộc tính này phải ít nhất chứa chuỗi “điện thoại” hoặc “&lt;hãng : Oppo, Xiaomi &gt;”.</w:t>
       </w:r>
     </w:p>
     <w:p>
@@ -9227,23 +9052,7 @@
         <w:jc w:val="both"/>
       </w:pPr>
       <w:r>
-        <w:t xml:space="preserve">Tuy nhiên có thể sẽ lòi ra các sản phẩm khác như: Ốp lưng, dây </w:t>
-      </w:r>
-      <w:proofErr w:type="gramStart"/>
-      <w:r>
-        <w:t>sạc,…</w:t>
-      </w:r>
-      <w:proofErr w:type="gramEnd"/>
-      <w:r>
-        <w:t xml:space="preserve">.. Nhóm tiến hành làm sạch thông qua </w:t>
-      </w:r>
-      <w:proofErr w:type="gramStart"/>
-      <w:r>
-        <w:t>giá,  giá</w:t>
-      </w:r>
-      <w:proofErr w:type="gramEnd"/>
-      <w:r>
-        <w:t xml:space="preserve"> gốc – original_price &lt; 1 triệu mặc đ</w:t>
+        <w:t>Tuy nhiên có thể sẽ lòi ra các sản phẩm khác như: Ốp lưng, dây sạc,….. Nhóm tiến hành làm sạch thông qua giá,  giá gốc – original_price &lt; 1 triệu mặc đ</w:t>
       </w:r>
       <w:r>
         <w:t xml:space="preserve">ịnh sẽ bị loại bỏ. </w:t>
@@ -10082,45 +9891,13 @@
         <w:t>Phân tích: Dựa vào sơ đồ ta thấy được, ở tập dữ liệu này</w:t>
       </w:r>
       <w:r>
-        <w:t xml:space="preserve"> hiện đang chia ra 2 nửa rõ rệt: Nhóm bán </w:t>
-      </w:r>
-      <w:proofErr w:type="gramStart"/>
-      <w:r>
-        <w:t xml:space="preserve">chạy </w:t>
-      </w:r>
-      <w:r>
-        <w:t xml:space="preserve"> (</w:t>
-      </w:r>
-      <w:proofErr w:type="gramEnd"/>
-      <w:r>
-        <w:t xml:space="preserve"> Xiaomi – khoảng 220000 máy, SamSung </w:t>
-      </w:r>
-      <w:proofErr w:type="gramStart"/>
-      <w:r>
-        <w:t>–  khoảng</w:t>
-      </w:r>
-      <w:proofErr w:type="gramEnd"/>
-      <w:r>
-        <w:t xml:space="preserve"> 170000 máy, Sony</w:t>
-      </w:r>
-      <w:r>
-        <w:t xml:space="preserve">, LG – khoảng 150000 máy, OPPO – khoảng 100000 </w:t>
-      </w:r>
-      <w:proofErr w:type="gramStart"/>
-      <w:r>
-        <w:t>máy )</w:t>
-      </w:r>
-      <w:proofErr w:type="gramEnd"/>
-      <w:r>
-        <w:t xml:space="preserve"> và nhóm bán ế </w:t>
-      </w:r>
-      <w:proofErr w:type="gramStart"/>
-      <w:r>
-        <w:t>( Apple</w:t>
-      </w:r>
-      <w:proofErr w:type="gramEnd"/>
-      <w:r>
-        <w:t xml:space="preserve">, HTC, VIVO, OPPO – khoảng từ 30000 máy trở xuống). Từ đó cho thấy nhóm thị trường đang đua tranh nhau khốc liệt, nhu cấu người dùng càng ngày hướng đến các đặc điểm của dòng máy Xiaomi, SamSung. </w:t>
+        <w:t xml:space="preserve"> hiện đang chia ra 2 nửa rõ rệt: Nhóm bán chạy </w:t>
+      </w:r>
+      <w:r>
+        <w:t xml:space="preserve"> ( Xiaomi – khoảng 220000 máy, SamSung –  khoảng 170000 máy, Sony</w:t>
+      </w:r>
+      <w:r>
+        <w:t xml:space="preserve">, LG – khoảng 150000 máy, OPPO – khoảng 100000 máy ) và nhóm bán ế ( Apple, HTC, VIVO, OPPO – khoảng từ 30000 máy trở xuống). Từ đó cho thấy nhóm thị trường đang đua tranh nhau khốc liệt, nhu cấu người dùng càng ngày hướng đến các đặc điểm của dòng máy Xiaomi, SamSung. </w:t>
       </w:r>
     </w:p>
     <w:p>
@@ -10242,29 +10019,13 @@
         <w:t>Phân tích:  Dựa vào bảng sơ đồ ta thấy được dataset này phần lớn các sản phẩm đều</w:t>
       </w:r>
       <w:r>
-        <w:t xml:space="preserve"> </w:t>
-      </w:r>
-      <w:proofErr w:type="gramStart"/>
-      <w:r>
-        <w:t>( khoảng</w:t>
-      </w:r>
-      <w:proofErr w:type="gramEnd"/>
-      <w:r>
-        <w:t xml:space="preserve"> 80 – 120 máy)</w:t>
+        <w:t xml:space="preserve"> ( khoảng 80 – 120 máy)</w:t>
       </w:r>
       <w:r>
         <w:t xml:space="preserve"> có số lượng bán ra </w:t>
       </w:r>
       <w:r>
-        <w:t xml:space="preserve">trên dưới 100 máy. Phần kém cạnh hơn (khoảng 40 – 60 máy) có số lượng bán ra trên dưới 1000 máy. Một phần rất nhỏ </w:t>
-      </w:r>
-      <w:proofErr w:type="gramStart"/>
-      <w:r>
-        <w:t>( dưới</w:t>
-      </w:r>
-      <w:proofErr w:type="gramEnd"/>
-      <w:r>
-        <w:t xml:space="preserve"> 5 máy) có số lượng bán ra trên dưới 10000 máy. Sơ đồ này phản ánh, s</w:t>
+        <w:t>trên dưới 100 máy. Phần kém cạnh hơn (khoảng 40 – 60 máy) có số lượng bán ra trên dưới 1000 máy. Một phần rất nhỏ ( dưới 5 máy) có số lượng bán ra trên dưới 10000 máy. Sơ đồ này phản ánh, s</w:t>
       </w:r>
       <w:r>
         <w:t>ố lượng mã hàng giảm dần khi sản lượng bán ra tăng cao</w:t>
@@ -10409,15 +10170,7 @@
         <w:t xml:space="preserve">Phân tích: </w:t>
       </w:r>
       <w:r>
-        <w:t xml:space="preserve">Ở sơ đồ này, phần lớn các chấm đang tập trung ở vùng </w:t>
-      </w:r>
-      <w:proofErr w:type="gramStart"/>
-      <w:r>
-        <w:t>( số</w:t>
-      </w:r>
-      <w:proofErr w:type="gramEnd"/>
-      <w:r>
-        <w:t xml:space="preserve"> lượng bán </w:t>
+        <w:t xml:space="preserve">Ở sơ đồ này, phần lớn các chấm đang tập trung ở vùng ( số lượng bán </w:t>
       </w:r>
       <m:oMath>
         <m:r>
@@ -10867,15 +10620,7 @@
     <w:p>
       <w:r>
         <w:tab/>
-        <w:t xml:space="preserve">Sau khi chạy kết quả, ở phần log, nhóm có lập trình print log để thấy được tỉ lệ thông tin được giữ lại ở mỗi PC, cũng như ở mỗi trục PC thì đại diện cho cái gì </w:t>
-      </w:r>
-      <w:proofErr w:type="gramStart"/>
-      <w:r>
-        <w:t>( thuộc</w:t>
-      </w:r>
-      <w:proofErr w:type="gramEnd"/>
-      <w:r>
-        <w:t xml:space="preserve"> tính nào đóng góp nhiều thông tin ở cột PC này nhất – hệ số Loadings):</w:t>
+        <w:t>Sau khi chạy kết quả, ở phần log, nhóm có lập trình print log để thấy được tỉ lệ thông tin được giữ lại ở mỗi PC, cũng như ở mỗi trục PC thì đại diện cho cái gì ( thuộc tính nào đóng góp nhiều thông tin ở cột PC này nhất – hệ số Loadings):</w:t>
       </w:r>
     </w:p>
     <w:p>
@@ -10994,15 +10739,7 @@
         <w:sym w:font="Wingdings" w:char="F0E0"/>
       </w:r>
       <w:r>
-        <w:t xml:space="preserve"> Ở đây ta thấy được PC1 và PC2 giữ lại được tổng 53,8% thông tin gốc. Một con số mặc dù chưa đúng với mong đợi của nhóm </w:t>
-      </w:r>
-      <w:proofErr w:type="gramStart"/>
-      <w:r>
-        <w:t>( &gt;</w:t>
-      </w:r>
-      <w:proofErr w:type="gramEnd"/>
-      <w:r>
-        <w:t xml:space="preserve"> 70%), tuy nhiên với dạng dữ liệu 2 chiều PC thì sẽ giúp Kmeans tính toán các cụm dễ hơn. </w:t>
+        <w:t xml:space="preserve"> Ở đây ta thấy được PC1 và PC2 giữ lại được tổng 53,8% thông tin gốc. Một con số mặc dù chưa đúng với mong đợi của nhóm ( &gt; 70%), tuy nhiên với dạng dữ liệu 2 chiều PC thì sẽ giúp Kmeans tính toán các cụm dễ hơn. </w:t>
       </w:r>
       <w:r>
         <w:t xml:space="preserve"> PC1 thì tỉ lệ thông tin đóng góp nhiều đang phản ảnh 2 cột – discount_price, original_price, cho thấy cột PC này đang nói</w:t>
@@ -11021,23 +10758,7 @@
         <w:t>Phân khúc Giá</w:t>
       </w:r>
       <w:r>
-        <w:t xml:space="preserve">. Tương </w:t>
-      </w:r>
-      <w:proofErr w:type="gramStart"/>
-      <w:r>
-        <w:t>tự,  PC</w:t>
-      </w:r>
-      <w:proofErr w:type="gramEnd"/>
-      <w:r>
-        <w:t xml:space="preserve">2 thì nói đến 2 </w:t>
-      </w:r>
-      <w:proofErr w:type="gramStart"/>
-      <w:r>
-        <w:t>cột  sold</w:t>
-      </w:r>
-      <w:proofErr w:type="gramEnd"/>
-      <w:r>
-        <w:t xml:space="preserve">_quantity và number_of_ratings, cho thấy cột PC này nói đến </w:t>
+        <w:t xml:space="preserve">. Tương tự,  PC2 thì nói đến 2 cột  sold_quantity và number_of_ratings, cho thấy cột PC này nói đến </w:t>
       </w:r>
       <w:r>
         <w:rPr>
@@ -11259,15 +10980,7 @@
         <w:t xml:space="preserve">VD: </w:t>
       </w:r>
       <w:r>
-        <w:t xml:space="preserve">chấm HaNoi thì gần với chấm Apple, chấm Xiaomi (ví </w:t>
-      </w:r>
-      <w:proofErr w:type="gramStart"/>
-      <w:r>
-        <w:t>dụ )</w:t>
-      </w:r>
-      <w:proofErr w:type="gramEnd"/>
-      <w:r>
-        <w:t xml:space="preserve"> --&gt; Các shop ở Hà Nội có xu hướng cháy hàng Apple, Xiaomi,</w:t>
+        <w:t>chấm HaNoi thì gần với chấm Apple, chấm Xiaomi (ví dụ ) --&gt; Các shop ở Hà Nội có xu hướng cháy hàng Apple, Xiaomi,</w:t>
       </w:r>
     </w:p>
     <w:p>
@@ -11393,7 +11106,7 @@
         <w:fldChar w:fldCharType="end"/>
       </w:r>
       <w:r>
-        <w:t>: Biểu đồ MCA thể hiện mối quan hệ giữa hãng và vị trí địa lý</w:t>
+        <w:t>: Biểu đồ CA thể hiện mối quan hệ giữa hãng và vị trí địa lý</w:t>
       </w:r>
       <w:bookmarkEnd w:id="39"/>
     </w:p>
@@ -11602,21 +11315,12 @@
       <w:r>
         <w:t xml:space="preserve"> có chỉ số Dimension 2 cao. Địa điểm nằm gần cụm này nhất là </w:t>
       </w:r>
-      <w:proofErr w:type="gramStart"/>
       <w:r>
         <w:rPr>
           <w:b/>
           <w:bCs/>
         </w:rPr>
-        <w:t>An</w:t>
-      </w:r>
-      <w:proofErr w:type="gramEnd"/>
-      <w:r>
-        <w:rPr>
-          <w:b/>
-          <w:bCs/>
-        </w:rPr>
-        <w:t xml:space="preserve"> Giang</w:t>
+        <w:t>An Giang</w:t>
       </w:r>
       <w:r>
         <w:t>. Đây có thể là dấu hiệu cho thấy các dòng điện thoại giá rẻ/cơ bản này có sự liên kết tốt hơn với một số thị trường tỉnh lẻ nhất định.</w:t>
@@ -11729,23 +11433,7 @@
         <w:t xml:space="preserve">: </w:t>
       </w:r>
       <w:r>
-        <w:t xml:space="preserve">Dữ liệu chưa có nhãn quyết định nên cần gom nhóm dữ liệu Kmeans để có thể chia ra các nhóm gồm các chấm có đặc tính tương quan nhau. </w:t>
-      </w:r>
-      <w:proofErr w:type="gramStart"/>
-      <w:r>
-        <w:t>( Các</w:t>
-      </w:r>
-      <w:proofErr w:type="gramEnd"/>
-      <w:r>
-        <w:t xml:space="preserve"> điểm đại diện trong 1 cụm càng gần nhau càng tốt) các cụm càng tách xa ra thì mô hình phân cụm tốt. Ở dự án này Kmeans được sử dụng để gom cụm dựa trên 2 biến PC1 và PC2 ở quá trình giảm chiều dữ liệu, sau khi gom cụm, kết quả trực quan kmeans được kết hợp với kết quả trực quan của </w:t>
-      </w:r>
-      <w:proofErr w:type="gramStart"/>
-      <w:r>
-        <w:t>CA  để</w:t>
-      </w:r>
-      <w:proofErr w:type="gramEnd"/>
-      <w:r>
-        <w:t xml:space="preserve"> hỗ trợ quyết định marketing cụ thể.</w:t>
+        <w:t>Dữ liệu chưa có nhãn quyết định nên cần gom nhóm dữ liệu Kmeans để có thể chia ra các nhóm gồm các chấm có đặc tính tương quan nhau. ( Các điểm đại diện trong 1 cụm càng gần nhau càng tốt) các cụm càng tách xa ra thì mô hình phân cụm tốt. Ở dự án này Kmeans được sử dụng để gom cụm dựa trên 2 biến PC1 và PC2 ở quá trình giảm chiều dữ liệu, sau khi gom cụm, kết quả trực quan kmeans được kết hợp với kết quả trực quan của CA  để hỗ trợ quyết định marketing cụ thể.</w:t>
       </w:r>
     </w:p>
     <w:p>
@@ -11990,53 +11678,19 @@
         <w:t xml:space="preserve"> Nhóm đang phân vân giữa 2 giá trị cụm là 2 và 3. Mặc dù ở </w:t>
       </w:r>
       <w:r>
-        <w:t xml:space="preserve">2 phương pháp xác định số cụm, giá trị K = 2 có tính vượt trội hơn về Độ biến thiên </w:t>
-      </w:r>
-      <w:proofErr w:type="gramStart"/>
-      <w:r>
-        <w:t>( Elbow</w:t>
-      </w:r>
-      <w:proofErr w:type="gramEnd"/>
-      <w:r>
-        <w:t xml:space="preserve">) cũng như Sithouette Score so với K = 3. Tuy nhiên xét về mục đích của bài toán dữ liệu, nếu như nhóm chỉ phân cụm 2 nhóm thì đặc điểm cụm sẽ rất hạn chế, vd: </w:t>
-      </w:r>
-      <w:proofErr w:type="gramStart"/>
-      <w:r>
-        <w:t>( giá</w:t>
-      </w:r>
-      <w:proofErr w:type="gramEnd"/>
-      <w:r>
-        <w:t xml:space="preserve"> rẻ bán chạy - giá cao bán </w:t>
-      </w:r>
-      <w:proofErr w:type="gramStart"/>
-      <w:r>
-        <w:t>ế )</w:t>
-      </w:r>
-      <w:proofErr w:type="gramEnd"/>
+        <w:t xml:space="preserve">2 phương pháp xác định số cụm, giá trị K = 2 có tính vượt trội hơn về Độ biến thiên ( Elbow) cũng như Sithouette Score so với K = 3. Tuy nhiên xét về mục đích của bài toán dữ liệu, nếu như nhóm chỉ phân cụm 2 nhóm thì đặc điểm cụm sẽ rất hạn chế, vd: </w:t>
+      </w:r>
+      <w:r>
+        <w:t>( giá rẻ bán chạy - giá cao bán ế )</w:t>
+      </w:r>
       <w:r>
         <w:t xml:space="preserve">. Với </w:t>
       </w:r>
       <w:r>
-        <w:t xml:space="preserve">K = </w:t>
-      </w:r>
-      <w:proofErr w:type="gramStart"/>
-      <w:r>
-        <w:t>3 :</w:t>
-      </w:r>
-      <w:proofErr w:type="gramEnd"/>
-      <w:r>
-        <w:t xml:space="preserve"> Mô hình phân cụm linh hoạt hơn </w:t>
-      </w:r>
-      <w:proofErr w:type="gramStart"/>
-      <w:r>
-        <w:t>(</w:t>
-      </w:r>
-      <w:r>
-        <w:t xml:space="preserve"> vd</w:t>
-      </w:r>
-      <w:proofErr w:type="gramEnd"/>
-      <w:r>
-        <w:t xml:space="preserve">: </w:t>
+        <w:t>K = 3 : Mô hình phân cụm linh hoạt hơn (</w:t>
+      </w:r>
+      <w:r>
+        <w:t xml:space="preserve"> vd: </w:t>
       </w:r>
       <w:r>
         <w:t xml:space="preserve"> Phân khúc Thấp – Trung Bình – Cao (flagship)</w:t>
@@ -12168,15 +11822,7 @@
         <w:t xml:space="preserve">Nhìn vào sơ đồ ta thấy được dữ liệu đang được chia thành 3 cụm 0 – xanh dương, 1 – cam, 2 – xanh lục. </w:t>
       </w:r>
       <w:r>
-        <w:t xml:space="preserve">Sau khi xác định được rạnh giới các cụm, nhóm sử dụng phép toán “Aggregated Mean </w:t>
-      </w:r>
-      <w:proofErr w:type="gramStart"/>
-      <w:r>
-        <w:t>“ –</w:t>
-      </w:r>
-      <w:proofErr w:type="gramEnd"/>
-      <w:r>
-        <w:t xml:space="preserve"> tính trung bình gộp. </w:t>
+        <w:t xml:space="preserve">Sau khi xác định được rạnh giới các cụm, nhóm sử dụng phép toán “Aggregated Mean “ – tính trung bình gộp. </w:t>
       </w:r>
       <w:r>
         <w:sym w:font="Wingdings" w:char="F0E0"/>
@@ -13034,26 +12680,10 @@
         </w:numPr>
       </w:pPr>
       <w:r>
-        <w:t xml:space="preserve">Chia tập train / test theo tỉ lệ </w:t>
-      </w:r>
-      <w:proofErr w:type="gramStart"/>
-      <w:r>
-        <w:t>80 :</w:t>
-      </w:r>
-      <w:proofErr w:type="gramEnd"/>
-      <w:r>
-        <w:t xml:space="preserve"> 20</w:t>
-      </w:r>
-      <w:r>
-        <w:t xml:space="preserve"> và </w:t>
-      </w:r>
-      <w:proofErr w:type="gramStart"/>
-      <w:r>
-        <w:t>70 :</w:t>
-      </w:r>
-      <w:proofErr w:type="gramEnd"/>
-      <w:r>
-        <w:t xml:space="preserve"> 30, sau đó lấy mô hình tối ưu hơn </w:t>
+        <w:t>Chia tập train / test theo tỉ lệ 80 : 20</w:t>
+      </w:r>
+      <w:r>
+        <w:t xml:space="preserve"> và 70 : 30, sau đó lấy mô hình tối ưu hơn </w:t>
       </w:r>
     </w:p>
     <w:p>
@@ -13293,15 +12923,7 @@
         <w:t xml:space="preserve">phân cụm khá ổn, đặc điệt hiệu quả cao với cụm 2. </w:t>
       </w:r>
       <w:r>
-        <w:t xml:space="preserve"> Mô hình nhận diện các sản phẩm cụm 0 và 1 ở mức khá ổn. Tỉ lệ dự đoán sai các trường hợp không nhiều </w:t>
-      </w:r>
-      <w:proofErr w:type="gramStart"/>
-      <w:r>
-        <w:t>( 46</w:t>
-      </w:r>
-      <w:proofErr w:type="gramEnd"/>
-      <w:r>
-        <w:t xml:space="preserve">/493 TH ~ 9.3%). </w:t>
+        <w:t xml:space="preserve"> Mô hình nhận diện các sản phẩm cụm 0 và 1 ở mức khá ổn. Tỉ lệ dự đoán sai các trường hợp không nhiều ( 46/493 TH ~ 9.3%). </w:t>
       </w:r>
     </w:p>
     <w:p>
@@ -13571,15 +13193,7 @@
     <w:p>
       <w:r>
         <w:tab/>
-        <w:t xml:space="preserve">Triển khai UI </w:t>
-      </w:r>
-      <w:proofErr w:type="gramStart"/>
-      <w:r>
-        <w:t>và  kiểm</w:t>
-      </w:r>
-      <w:proofErr w:type="gramEnd"/>
-      <w:r>
-        <w:t xml:space="preserve"> thử dự đoán của mô hình: </w:t>
+        <w:t xml:space="preserve">Triển khai UI và  kiểm thử dự đoán của mô hình: </w:t>
       </w:r>
     </w:p>
     <w:p>

</xml_diff>